<commit_message>
Comments RTL & Microarquitecture_Schematic Report
</commit_message>
<xml_diff>
--- a/Team9_Project_Mod5/documentation/8bit PWM.docx
+++ b/Team9_Project_Mod5/documentation/8bit PWM.docx
@@ -651,67 +651,75 @@
           <w:lang w:val="es-419"/>
         </w:rPr>
       </w:pPr>
-      <w:commentRangeStart w:id="0"/>
-      <w:commentRangeEnd w:id="0"/>
-      <w:r>
-        <w:rPr>
-          <w:rStyle w:val="Refdecomentario"/>
-        </w:rPr>
-        <w:commentReference w:id="0"/>
-      </w:r>
-    </w:p>
-    <w:p>
-      <w:pPr>
-        <w:rPr>
-          <w:lang w:val="es-419"/>
-        </w:rPr>
-      </w:pPr>
-    </w:p>
-    <w:p>
-      <w:pPr>
-        <w:rPr>
-          <w:lang w:val="es-419"/>
-        </w:rPr>
-      </w:pPr>
-    </w:p>
-    <w:p>
-      <w:pPr>
-        <w:rPr>
-          <w:lang w:val="es-419"/>
-        </w:rPr>
-      </w:pPr>
-    </w:p>
-    <w:p>
-      <w:pPr>
-        <w:rPr>
-          <w:lang w:val="es-419"/>
-        </w:rPr>
-      </w:pPr>
-    </w:p>
-    <w:p>
-      <w:pPr>
-        <w:rPr>
-          <w:lang w:val="es-419"/>
-        </w:rPr>
-      </w:pPr>
-    </w:p>
-    <w:p>
-      <w:pPr>
-        <w:rPr>
-          <w:lang w:val="es-419"/>
-        </w:rPr>
-      </w:pPr>
-    </w:p>
-    <w:p>
-      <w:pPr>
-        <w:rPr>
-          <w:lang w:val="es-419"/>
-        </w:rPr>
-      </w:pPr>
-    </w:p>
-    <w:p>
-      <w:pPr>
-        <w:rPr>
+    </w:p>
+    <w:p>
+      <w:pPr>
+        <w:rPr>
+          <w:lang w:val="es-419"/>
+        </w:rPr>
+      </w:pPr>
+    </w:p>
+    <w:p>
+      <w:pPr>
+        <w:rPr>
+          <w:lang w:val="es-419"/>
+        </w:rPr>
+      </w:pPr>
+    </w:p>
+    <w:p>
+      <w:pPr>
+        <w:rPr>
+          <w:lang w:val="es-419"/>
+        </w:rPr>
+      </w:pPr>
+    </w:p>
+    <w:p>
+      <w:pPr>
+        <w:rPr>
+          <w:lang w:val="es-419"/>
+        </w:rPr>
+      </w:pPr>
+    </w:p>
+    <w:p>
+      <w:pPr>
+        <w:rPr>
+          <w:lang w:val="es-419"/>
+        </w:rPr>
+      </w:pPr>
+    </w:p>
+    <w:p>
+      <w:pPr>
+        <w:rPr>
+          <w:lang w:val="es-419"/>
+        </w:rPr>
+      </w:pPr>
+    </w:p>
+    <w:p>
+      <w:pPr>
+        <w:ind w:left="1416" w:firstLine="708"/>
+        <w:rPr>
+          <w:b/>
+          <w:bCs/>
+          <w:i/>
+          <w:iCs/>
+          <w:sz w:val="24"/>
+          <w:szCs w:val="24"/>
+          <w:u w:val="single"/>
+          <w:lang w:val="es-419"/>
+        </w:rPr>
+      </w:pPr>
+    </w:p>
+    <w:p>
+      <w:pPr>
+        <w:ind w:left="1416" w:firstLine="708"/>
+        <w:rPr>
+          <w:b/>
+          <w:bCs/>
+          <w:i/>
+          <w:iCs/>
+          <w:sz w:val="24"/>
+          <w:szCs w:val="24"/>
+          <w:u w:val="single"/>
           <w:lang w:val="es-419"/>
         </w:rPr>
       </w:pPr>
@@ -1274,6 +1282,7 @@
         <w:rPr>
           <w:b/>
           <w:bCs/>
+          <w:noProof/>
           <w:color w:val="1F3864" w:themeColor="accent1" w:themeShade="80"/>
         </w:rPr>
         <w:t>1</w:t>
@@ -1440,6 +1449,7 @@
         <w:rPr>
           <w:b/>
           <w:bCs/>
+          <w:noProof/>
           <w:color w:val="1F3864" w:themeColor="accent1" w:themeShade="80"/>
         </w:rPr>
         <w:t>2</w:t>
@@ -1665,6 +1675,7 @@
         <w:rPr>
           <w:b/>
           <w:bCs/>
+          <w:noProof/>
           <w:color w:val="1F3864" w:themeColor="accent1" w:themeShade="80"/>
         </w:rPr>
         <w:t>3</w:t>
@@ -1702,6 +1713,13 @@
       </w:r>
     </w:p>
     <w:p>
+      <w:pPr>
+        <w:rPr>
+          <w:rFonts w:eastAsiaTheme="minorEastAsia"/>
+          <w:b/>
+          <w:color w:val="525252" w:themeColor="accent3" w:themeShade="80"/>
+        </w:rPr>
+      </w:pPr>
       <m:oMathPara>
         <m:oMath>
           <m:r>
@@ -1833,7 +1851,7 @@
               <w:rFonts w:ascii="Cambria Math" w:hAnsi="Cambria Math"/>
               <w:color w:val="525252" w:themeColor="accent3" w:themeShade="80"/>
             </w:rPr>
-            <m:t>=781 Cycles</m:t>
+            <m:t>=390 Cycles</m:t>
           </m:r>
         </m:oMath>
       </m:oMathPara>
@@ -1884,6 +1902,7 @@
         <w:rPr>
           <w:b/>
           <w:bCs/>
+          <w:noProof/>
           <w:color w:val="1F3864" w:themeColor="accent1" w:themeShade="80"/>
         </w:rPr>
         <w:t>4</w:t>
@@ -1964,7 +1983,718 @@
           <w:sz w:val="24"/>
           <w:szCs w:val="24"/>
         </w:rPr>
-        <w:t>4.- RTL</w:t>
+        <w:t xml:space="preserve">4.- </w:t>
+      </w:r>
+      <w:r>
+        <w:rPr>
+          <w:rFonts w:asciiTheme="minorHAnsi" w:hAnsiTheme="minorHAnsi" w:cstheme="minorHAnsi"/>
+          <w:b/>
+          <w:bCs/>
+          <w:color w:val="000000" w:themeColor="text1"/>
+          <w:sz w:val="24"/>
+          <w:szCs w:val="24"/>
+        </w:rPr>
+        <w:t>MICROARCHITECTURE</w:t>
+      </w:r>
+    </w:p>
+    <w:p>
+      <w:r>
+        <w:rPr>
+          <w:noProof/>
+        </w:rPr>
+        <w:drawing>
+          <wp:anchor distT="0" distB="0" distL="114300" distR="114300" simplePos="0" relativeHeight="251682816" behindDoc="0" locked="0" layoutInCell="1" allowOverlap="1" wp14:anchorId="3117CDEF" wp14:editId="4895EF18">
+            <wp:simplePos x="0" y="0"/>
+            <wp:positionH relativeFrom="column">
+              <wp:posOffset>-12701</wp:posOffset>
+            </wp:positionH>
+            <wp:positionV relativeFrom="paragraph">
+              <wp:posOffset>26670</wp:posOffset>
+            </wp:positionV>
+            <wp:extent cx="2811649" cy="1695450"/>
+            <wp:effectExtent l="19050" t="19050" r="27305" b="19050"/>
+            <wp:wrapNone/>
+            <wp:docPr id="140070969" name="Imagen 1"/>
+            <wp:cNvGraphicFramePr>
+              <a:graphicFrameLocks xmlns:a="http://schemas.openxmlformats.org/drawingml/2006/main" noChangeAspect="1"/>
+            </wp:cNvGraphicFramePr>
+            <a:graphic xmlns:a="http://schemas.openxmlformats.org/drawingml/2006/main">
+              <a:graphicData uri="http://schemas.openxmlformats.org/drawingml/2006/picture">
+                <pic:pic xmlns:pic="http://schemas.openxmlformats.org/drawingml/2006/picture">
+                  <pic:nvPicPr>
+                    <pic:cNvPr id="140070969" name=""/>
+                    <pic:cNvPicPr/>
+                  </pic:nvPicPr>
+                  <pic:blipFill>
+                    <a:blip r:embed="rId13" cstate="print">
+                      <a:extLst>
+                        <a:ext uri="{28A0092B-C50C-407E-A947-70E740481C1C}">
+                          <a14:useLocalDpi xmlns:a14="http://schemas.microsoft.com/office/drawing/2010/main" val="0"/>
+                        </a:ext>
+                      </a:extLst>
+                    </a:blip>
+                    <a:stretch>
+                      <a:fillRect/>
+                    </a:stretch>
+                  </pic:blipFill>
+                  <pic:spPr>
+                    <a:xfrm>
+                      <a:off x="0" y="0"/>
+                      <a:ext cx="2816882" cy="1698606"/>
+                    </a:xfrm>
+                    <a:prstGeom prst="rect">
+                      <a:avLst/>
+                    </a:prstGeom>
+                    <a:ln>
+                      <a:solidFill>
+                        <a:schemeClr val="tx1"/>
+                      </a:solidFill>
+                    </a:ln>
+                  </pic:spPr>
+                </pic:pic>
+              </a:graphicData>
+            </a:graphic>
+            <wp14:sizeRelH relativeFrom="page">
+              <wp14:pctWidth>0</wp14:pctWidth>
+            </wp14:sizeRelH>
+            <wp14:sizeRelV relativeFrom="page">
+              <wp14:pctHeight>0</wp14:pctHeight>
+            </wp14:sizeRelV>
+          </wp:anchor>
+        </w:drawing>
+      </w:r>
+    </w:p>
+    <w:p/>
+    <w:p/>
+    <w:p/>
+    <w:p/>
+    <w:p/>
+    <w:p>
+      <w:pPr>
+        <w:rPr>
+          <w:b/>
+          <w:bCs/>
+          <w:i/>
+          <w:iCs/>
+          <w:color w:val="002060"/>
+          <w:lang w:val="es-419"/>
+        </w:rPr>
+      </w:pPr>
+    </w:p>
+    <w:p>
+      <w:pPr>
+        <w:rPr>
+          <w:b/>
+          <w:bCs/>
+          <w:i/>
+          <w:iCs/>
+          <w:color w:val="002060"/>
+          <w:lang w:val="es-419"/>
+        </w:rPr>
+      </w:pPr>
+      <w:r>
+        <w:rPr>
+          <w:b/>
+          <w:bCs/>
+          <w:i/>
+          <w:iCs/>
+          <w:color w:val="002060"/>
+          <w:lang w:val="es-419"/>
+        </w:rPr>
+        <w:t xml:space="preserve">clk: </w:t>
+      </w:r>
+      <w:r>
+        <w:rPr>
+          <w:lang w:val="es-419"/>
+        </w:rPr>
+        <w:t>Reloj del sistema.</w:t>
+      </w:r>
+    </w:p>
+    <w:p>
+      <w:pPr>
+        <w:rPr>
+          <w:lang w:val="es-419"/>
+        </w:rPr>
+      </w:pPr>
+      <w:r>
+        <w:rPr>
+          <w:b/>
+          <w:bCs/>
+          <w:i/>
+          <w:iCs/>
+          <w:color w:val="002060"/>
+          <w:lang w:val="es-419"/>
+        </w:rPr>
+        <w:t xml:space="preserve">rst: </w:t>
+      </w:r>
+      <w:r>
+        <w:rPr>
+          <w:lang w:val="es-419"/>
+        </w:rPr>
+        <w:t>Reset síncrono, activo en alto.</w:t>
+      </w:r>
+    </w:p>
+    <w:p>
+      <w:pPr>
+        <w:rPr>
+          <w:b/>
+          <w:bCs/>
+          <w:i/>
+          <w:iCs/>
+          <w:color w:val="002060"/>
+          <w:lang w:val="es-419"/>
+        </w:rPr>
+      </w:pPr>
+      <w:r>
+        <w:rPr>
+          <w:b/>
+          <w:bCs/>
+          <w:i/>
+          <w:iCs/>
+          <w:color w:val="002060"/>
+          <w:lang w:val="es-419"/>
+        </w:rPr>
+        <w:t xml:space="preserve">duty_cycle[7:0]: </w:t>
+      </w:r>
+      <w:r>
+        <w:rPr>
+          <w:lang w:val="es-419"/>
+        </w:rPr>
+        <w:t>Valor del ciclo de trabajo (0 = 0%, 255 = 100%).</w:t>
+      </w:r>
+    </w:p>
+    <w:p>
+      <w:pPr>
+        <w:rPr>
+          <w:b/>
+          <w:bCs/>
+          <w:i/>
+          <w:iCs/>
+          <w:color w:val="002060"/>
+          <w:lang w:val="es-419"/>
+        </w:rPr>
+      </w:pPr>
+      <w:r>
+        <w:rPr>
+          <w:b/>
+          <w:bCs/>
+          <w:i/>
+          <w:iCs/>
+          <w:color w:val="002060"/>
+          <w:lang w:val="es-419"/>
+        </w:rPr>
+        <w:t xml:space="preserve">pwm_out: </w:t>
+      </w:r>
+      <w:r>
+        <w:rPr>
+          <w:lang w:val="es-419"/>
+        </w:rPr>
+        <w:t>Señal PWM generada (digital: 0 o 1).</w:t>
+      </w:r>
+    </w:p>
+    <w:p>
+      <w:pPr>
+        <w:rPr>
+          <w:lang w:val="es-419"/>
+        </w:rPr>
+      </w:pPr>
+      <w:r>
+        <w:rPr>
+          <w:b/>
+          <w:bCs/>
+          <w:i/>
+          <w:iCs/>
+          <w:color w:val="002060"/>
+          <w:lang w:val="es-419"/>
+        </w:rPr>
+        <w:t>Tick Counter (tick_counter</w:t>
+      </w:r>
+      <w:r>
+        <w:rPr>
+          <w:b/>
+          <w:bCs/>
+          <w:i/>
+          <w:iCs/>
+          <w:color w:val="002060"/>
+          <w:lang w:val="es-419"/>
+        </w:rPr>
+        <w:t xml:space="preserve">). - </w:t>
+      </w:r>
+      <w:r>
+        <w:rPr>
+          <w:lang w:val="es-419"/>
+        </w:rPr>
+        <w:t>Cuenta cuántos ciclos de reloj han pasado. Se reinicia cuando alcanza TICKS_PER_STEP</w:t>
+      </w:r>
+      <w:r>
+        <w:rPr>
+          <w:lang w:val="es-419"/>
+        </w:rPr>
+        <w:t>.</w:t>
+      </w:r>
+    </w:p>
+    <w:p>
+      <w:pPr>
+        <w:rPr>
+          <w:lang w:val="es-419"/>
+        </w:rPr>
+      </w:pPr>
+      <w:r>
+        <w:rPr>
+          <w:b/>
+          <w:bCs/>
+          <w:i/>
+          <w:iCs/>
+          <w:color w:val="002060"/>
+          <w:lang w:val="es-419"/>
+        </w:rPr>
+        <w:t>PWM Counter (pwm_counter</w:t>
+      </w:r>
+      <w:r>
+        <w:rPr>
+          <w:b/>
+          <w:bCs/>
+          <w:i/>
+          <w:iCs/>
+          <w:color w:val="002060"/>
+          <w:lang w:val="es-419"/>
+        </w:rPr>
+        <w:t xml:space="preserve">). - </w:t>
+      </w:r>
+      <w:r>
+        <w:rPr>
+          <w:lang w:val="es-419"/>
+        </w:rPr>
+        <w:t>Cuenta de 0 a 255 y se incrementa cada vez que tick_counter reinicia.</w:t>
+      </w:r>
+    </w:p>
+    <w:p>
+      <w:pPr>
+        <w:rPr>
+          <w:b/>
+          <w:bCs/>
+          <w:i/>
+          <w:iCs/>
+          <w:color w:val="002060"/>
+          <w:lang w:val="es-419"/>
+        </w:rPr>
+      </w:pPr>
+      <w:r>
+        <w:rPr>
+          <w:b/>
+          <w:bCs/>
+          <w:i/>
+          <w:iCs/>
+          <w:color w:val="002060"/>
+        </w:rPr>
+        <w:t xml:space="preserve">Comparador </w:t>
+      </w:r>
+      <w:r>
+        <w:rPr>
+          <w:b/>
+          <w:bCs/>
+          <w:i/>
+          <w:iCs/>
+          <w:color w:val="002060"/>
+        </w:rPr>
+        <w:t>PWM</w:t>
+      </w:r>
+      <w:r>
+        <w:rPr>
+          <w:b/>
+          <w:bCs/>
+          <w:i/>
+          <w:iCs/>
+          <w:color w:val="002060"/>
+        </w:rPr>
+        <w:t xml:space="preserve">. </w:t>
+      </w:r>
+      <w:r>
+        <w:t xml:space="preserve">- </w:t>
+      </w:r>
+      <w:r>
+        <w:t xml:space="preserve">Compara pwm_counter &lt; duty_cycle. </w:t>
+      </w:r>
+      <w:r>
+        <w:rPr>
+          <w:lang w:val="es-419"/>
+        </w:rPr>
+        <w:t>Si es verdadero, pwm_out = 1, de lo contrario 0.</w:t>
+      </w:r>
+    </w:p>
+    <w:p>
+      <w:pPr>
+        <w:rPr>
+          <w:b/>
+          <w:bCs/>
+          <w:i/>
+          <w:iCs/>
+          <w:color w:val="002060"/>
+          <w:lang w:val="es-419"/>
+        </w:rPr>
+      </w:pPr>
+      <w:r>
+        <w:rPr>
+          <w:b/>
+          <w:bCs/>
+          <w:i/>
+          <w:iCs/>
+          <w:color w:val="002060"/>
+          <w:lang w:val="es-419"/>
+        </w:rPr>
+        <w:t xml:space="preserve">Generador </w:t>
+      </w:r>
+      <w:r>
+        <w:rPr>
+          <w:b/>
+          <w:bCs/>
+          <w:i/>
+          <w:iCs/>
+          <w:color w:val="002060"/>
+          <w:lang w:val="es-419"/>
+        </w:rPr>
+        <w:t xml:space="preserve">PWM. - </w:t>
+      </w:r>
+      <w:r>
+        <w:rPr>
+          <w:lang w:val="es-419"/>
+        </w:rPr>
+        <w:t>Resultado del comparador se envía a pwm_out, generando la onda cuadrada modulada.</w:t>
+      </w:r>
+    </w:p>
+    <w:p>
+      <w:pPr>
+        <w:rPr>
+          <w:b/>
+          <w:bCs/>
+          <w:i/>
+          <w:iCs/>
+          <w:u w:val="single"/>
+          <w:lang w:val="es-419"/>
+        </w:rPr>
+      </w:pPr>
+      <w:r>
+        <w:rPr>
+          <w:b/>
+          <w:bCs/>
+          <w:i/>
+          <w:iCs/>
+          <w:highlight w:val="yellow"/>
+          <w:u w:val="single"/>
+          <w:lang w:val="es-419"/>
+        </w:rPr>
+        <w:t>NOTAS:</w:t>
+      </w:r>
+    </w:p>
+    <w:p>
+      <w:pPr>
+        <w:rPr>
+          <w:lang w:val="es-419"/>
+        </w:rPr>
+      </w:pPr>
+      <w:r>
+        <w:rPr>
+          <w:b/>
+          <w:bCs/>
+          <w:lang w:val="es-419"/>
+        </w:rPr>
+        <w:t>TICKS_PER_STEP</w:t>
+      </w:r>
+      <w:r>
+        <w:rPr>
+          <w:lang w:val="es-419"/>
+        </w:rPr>
+        <w:t xml:space="preserve"> define la resolución temporal para lograr 500 Hz.</w:t>
+      </w:r>
+    </w:p>
+    <w:p>
+      <w:pPr>
+        <w:rPr>
+          <w:lang w:val="es-419"/>
+        </w:rPr>
+      </w:pPr>
+      <w:r>
+        <w:rPr>
+          <w:b/>
+          <w:bCs/>
+          <w:lang w:val="es-419"/>
+        </w:rPr>
+        <w:t>PWM_RESOLUTION = 256</w:t>
+      </w:r>
+      <w:r>
+        <w:rPr>
+          <w:lang w:val="es-419"/>
+        </w:rPr>
+        <w:t xml:space="preserve"> define los niveles de precisión de duty.</w:t>
+      </w:r>
+    </w:p>
+    <w:p>
+      <w:pPr>
+        <w:rPr>
+          <w:lang w:val="es-419"/>
+        </w:rPr>
+      </w:pPr>
+      <w:r>
+        <w:rPr>
+          <w:lang w:val="es-419"/>
+        </w:rPr>
+        <w:t>Esta arquitectura genera una frecuencia constante con un duty variable.</w:t>
+      </w:r>
+    </w:p>
+    <w:p>
+      <w:pPr>
+        <w:pStyle w:val="Ttulo2"/>
+        <w:rPr>
+          <w:rFonts w:asciiTheme="minorHAnsi" w:hAnsiTheme="minorHAnsi" w:cstheme="minorHAnsi"/>
+          <w:b/>
+          <w:bCs/>
+          <w:color w:val="000000" w:themeColor="text1"/>
+          <w:sz w:val="24"/>
+          <w:szCs w:val="24"/>
+        </w:rPr>
+      </w:pPr>
+      <w:r>
+        <w:rPr>
+          <w:rFonts w:asciiTheme="minorHAnsi" w:hAnsiTheme="minorHAnsi" w:cstheme="minorHAnsi"/>
+          <w:b/>
+          <w:bCs/>
+          <w:color w:val="000000" w:themeColor="text1"/>
+          <w:sz w:val="24"/>
+          <w:szCs w:val="24"/>
+        </w:rPr>
+        <w:t>5</w:t>
+      </w:r>
+      <w:r>
+        <w:rPr>
+          <w:rFonts w:asciiTheme="minorHAnsi" w:hAnsiTheme="minorHAnsi" w:cstheme="minorHAnsi"/>
+          <w:b/>
+          <w:bCs/>
+          <w:color w:val="000000" w:themeColor="text1"/>
+          <w:sz w:val="24"/>
+          <w:szCs w:val="24"/>
+        </w:rPr>
+        <w:t xml:space="preserve">.- </w:t>
+      </w:r>
+      <w:r>
+        <w:rPr>
+          <w:rFonts w:asciiTheme="minorHAnsi" w:hAnsiTheme="minorHAnsi" w:cstheme="minorHAnsi"/>
+          <w:b/>
+          <w:bCs/>
+          <w:color w:val="000000" w:themeColor="text1"/>
+          <w:sz w:val="24"/>
+          <w:szCs w:val="24"/>
+        </w:rPr>
+        <w:t>OPERATION SEQUENCE</w:t>
+      </w:r>
+    </w:p>
+    <w:p>
+      <w:pPr>
+        <w:numPr>
+          <w:ilvl w:val="0"/>
+          <w:numId w:val="19"/>
+        </w:numPr>
+        <w:spacing w:line="240" w:lineRule="auto"/>
+        <w:rPr>
+          <w:lang w:val="es-419"/>
+        </w:rPr>
+      </w:pPr>
+      <w:r>
+        <w:rPr>
+          <w:lang w:val="es-419"/>
+        </w:rPr>
+        <w:t xml:space="preserve">Al comenzar, el sistema se </w:t>
+      </w:r>
+      <w:r>
+        <w:rPr>
+          <w:b/>
+          <w:bCs/>
+          <w:lang w:val="es-419"/>
+        </w:rPr>
+        <w:t>resetea</w:t>
+      </w:r>
+      <w:r>
+        <w:rPr>
+          <w:lang w:val="es-419"/>
+        </w:rPr>
+        <w:t xml:space="preserve"> y los contadores se ponen en 0.</w:t>
+      </w:r>
+    </w:p>
+    <w:p>
+      <w:pPr>
+        <w:numPr>
+          <w:ilvl w:val="0"/>
+          <w:numId w:val="19"/>
+        </w:numPr>
+        <w:spacing w:line="240" w:lineRule="auto"/>
+        <w:rPr>
+          <w:b/>
+          <w:bCs/>
+          <w:lang w:val="es-419"/>
+        </w:rPr>
+      </w:pPr>
+      <w:r>
+        <w:rPr>
+          <w:lang w:val="es-419"/>
+        </w:rPr>
+        <w:t>En cada flanco de reloj (</w:t>
+      </w:r>
+      <w:r>
+        <w:rPr>
+          <w:b/>
+          <w:bCs/>
+          <w:lang w:val="es-419"/>
+        </w:rPr>
+        <w:t>posedge clk), el tick_counter se incrementa.</w:t>
+      </w:r>
+    </w:p>
+    <w:p>
+      <w:pPr>
+        <w:numPr>
+          <w:ilvl w:val="0"/>
+          <w:numId w:val="19"/>
+        </w:numPr>
+        <w:rPr>
+          <w:b/>
+          <w:bCs/>
+        </w:rPr>
+      </w:pPr>
+      <w:r>
+        <w:rPr>
+          <w:b/>
+          <w:bCs/>
+        </w:rPr>
+        <w:t>Si</w:t>
+      </w:r>
+      <w:r>
+        <w:rPr>
+          <w:b/>
+          <w:bCs/>
+        </w:rPr>
+        <w:t xml:space="preserve"> tick_counter == TICKS_PER_STEP - 1:</w:t>
+      </w:r>
+    </w:p>
+    <w:p>
+      <w:pPr>
+        <w:pStyle w:val="Prrafodelista"/>
+        <w:numPr>
+          <w:ilvl w:val="0"/>
+          <w:numId w:val="22"/>
+        </w:numPr>
+      </w:pPr>
+      <w:r>
+        <w:t>Se reinicia tick_counter.</w:t>
+      </w:r>
+    </w:p>
+    <w:p>
+      <w:pPr>
+        <w:pStyle w:val="Prrafodelista"/>
+        <w:numPr>
+          <w:ilvl w:val="0"/>
+          <w:numId w:val="22"/>
+        </w:numPr>
+        <w:rPr>
+          <w:lang w:val="es-419"/>
+        </w:rPr>
+      </w:pPr>
+      <w:r>
+        <w:rPr>
+          <w:lang w:val="es-419"/>
+        </w:rPr>
+        <w:t>Se incrementa pwm_counter (0–255 cíclico).</w:t>
+      </w:r>
+    </w:p>
+    <w:p>
+      <w:pPr>
+        <w:numPr>
+          <w:ilvl w:val="0"/>
+          <w:numId w:val="19"/>
+        </w:numPr>
+        <w:spacing w:line="240" w:lineRule="auto"/>
+        <w:rPr>
+          <w:lang w:val="es-419"/>
+        </w:rPr>
+      </w:pPr>
+      <w:r>
+        <w:rPr>
+          <w:lang w:val="es-419"/>
+        </w:rPr>
+        <w:t xml:space="preserve">En todo momento, </w:t>
+      </w:r>
+      <w:r>
+        <w:rPr>
+          <w:b/>
+          <w:bCs/>
+          <w:lang w:val="es-419"/>
+        </w:rPr>
+        <w:t>pwm_out</w:t>
+      </w:r>
+      <w:r>
+        <w:rPr>
+          <w:lang w:val="es-419"/>
+        </w:rPr>
+        <w:t xml:space="preserve"> se calcula en combinacional:</w:t>
+      </w:r>
+    </w:p>
+    <w:p>
+      <w:pPr>
+        <w:pStyle w:val="Prrafodelista"/>
+        <w:numPr>
+          <w:ilvl w:val="0"/>
+          <w:numId w:val="23"/>
+        </w:numPr>
+      </w:pPr>
+      <w:r>
+        <w:t>Si pwm_counter &lt; duty_cycle → pwm_out = 1</w:t>
+      </w:r>
+    </w:p>
+    <w:p>
+      <w:pPr>
+        <w:pStyle w:val="Prrafodelista"/>
+        <w:numPr>
+          <w:ilvl w:val="0"/>
+          <w:numId w:val="23"/>
+        </w:numPr>
+      </w:pPr>
+      <w:r>
+        <w:t>Si no → pwm_out = 0</w:t>
+      </w:r>
+    </w:p>
+    <w:p>
+      <w:pPr>
+        <w:pStyle w:val="Ttulo2"/>
+        <w:rPr>
+          <w:rFonts w:asciiTheme="minorHAnsi" w:hAnsiTheme="minorHAnsi" w:cstheme="minorHAnsi"/>
+          <w:b/>
+          <w:bCs/>
+          <w:color w:val="000000" w:themeColor="text1"/>
+          <w:sz w:val="24"/>
+          <w:szCs w:val="24"/>
+          <w:lang w:val="es-419"/>
+        </w:rPr>
+      </w:pPr>
+      <w:r>
+        <w:rPr>
+          <w:rFonts w:asciiTheme="minorHAnsi" w:hAnsiTheme="minorHAnsi" w:cstheme="minorHAnsi"/>
+          <w:b/>
+          <w:bCs/>
+          <w:color w:val="000000" w:themeColor="text1"/>
+          <w:sz w:val="24"/>
+          <w:szCs w:val="24"/>
+          <w:lang w:val="es-419"/>
+        </w:rPr>
+        <w:t>6</w:t>
+      </w:r>
+      <w:r>
+        <w:rPr>
+          <w:rFonts w:asciiTheme="minorHAnsi" w:hAnsiTheme="minorHAnsi" w:cstheme="minorHAnsi"/>
+          <w:b/>
+          <w:bCs/>
+          <w:color w:val="000000" w:themeColor="text1"/>
+          <w:sz w:val="24"/>
+          <w:szCs w:val="24"/>
+          <w:lang w:val="es-419"/>
+        </w:rPr>
+        <w:t>.- RTL</w:t>
       </w:r>
     </w:p>
     <w:p>
@@ -2057,9 +2787,72 @@
         <w:spacing w:line="240" w:lineRule="auto"/>
         <w:jc w:val="both"/>
       </w:pPr>
-      <w:r>
+    </w:p>
+    <w:p>
+      <w:pPr>
+        <w:spacing w:line="240" w:lineRule="auto"/>
+        <w:jc w:val="both"/>
+      </w:pPr>
+      <w:r>
+        <w:t xml:space="preserve">For this explanation we did a </w:t>
+      </w:r>
+      <w:r>
+        <w:rPr>
+          <w:b/>
+          <w:bCs/>
+        </w:rPr>
+        <w:t>“pseudocode representation”</w:t>
+      </w:r>
+      <w:r>
+        <w:t xml:space="preserve"> that show, how it is works.</w:t>
+      </w:r>
+    </w:p>
+    <w:p>
+      <w:pPr>
+        <w:spacing w:line="240" w:lineRule="auto"/>
+        <w:jc w:val="both"/>
+      </w:pPr>
+    </w:p>
+    <w:p>
+      <w:pPr>
+        <w:spacing w:line="240" w:lineRule="auto"/>
+        <w:jc w:val="both"/>
+        <w:rPr>
+          <w:b/>
+          <w:bCs/>
+          <w:i/>
+          <w:iCs/>
+          <w:u w:val="single"/>
+        </w:rPr>
+      </w:pPr>
+      <w:r>
+        <w:rPr>
+          <w:b/>
+          <w:bCs/>
+          <w:i/>
+          <w:iCs/>
+          <w:u w:val="single"/>
+        </w:rPr>
         <w:t>Pseudocode representation:</w:t>
       </w:r>
+    </w:p>
+    <w:p>
+      <w:pPr>
+        <w:spacing w:line="240" w:lineRule="auto"/>
+        <w:jc w:val="both"/>
+      </w:pPr>
+    </w:p>
+    <w:p>
+      <w:pPr>
+        <w:spacing w:line="240" w:lineRule="auto"/>
+        <w:jc w:val="both"/>
+      </w:pPr>
+    </w:p>
+    <w:p>
+      <w:pPr>
+        <w:spacing w:line="240" w:lineRule="auto"/>
+        <w:jc w:val="both"/>
+      </w:pPr>
     </w:p>
     <w:p>
       <w:pPr>
@@ -2079,6 +2872,7 @@
           <w:i/>
           <w:iCs/>
         </w:rPr>
+        <w:lastRenderedPageBreak/>
         <w:t>if (counter &lt; duty_cycle)</w:t>
       </w:r>
     </w:p>
@@ -3149,6 +3943,7 @@
         <w:rPr>
           <w:b/>
           <w:bCs/>
+          <w:noProof/>
           <w:color w:val="1F3864" w:themeColor="accent1" w:themeShade="80"/>
         </w:rPr>
         <w:t>1</w:t>
@@ -3178,8 +3973,6 @@
         <w:t>Function Diagram</w:t>
       </w:r>
     </w:p>
-    <w:p/>
-    <w:p/>
     <w:p>
       <w:pPr>
         <w:spacing w:line="240" w:lineRule="auto"/>
@@ -3828,7 +4621,6 @@
           <w:sz w:val="24"/>
           <w:szCs w:val="24"/>
         </w:rPr>
-        <w:lastRenderedPageBreak/>
         <w:t>6</w:t>
       </w:r>
       <w:r>
@@ -4758,13 +5550,556 @@
         <w:t>CODE</w:t>
       </w:r>
     </w:p>
+    <w:p>
+      <w:pPr>
+        <w:spacing w:line="240" w:lineRule="auto"/>
+        <w:jc w:val="both"/>
+        <w:rPr>
+          <w:b/>
+          <w:bCs/>
+        </w:rPr>
+      </w:pPr>
+      <w:r>
+        <w:t xml:space="preserve">For the </w:t>
+      </w:r>
+      <w:r>
+        <w:rPr>
+          <w:b/>
+          <w:bCs/>
+        </w:rPr>
+        <w:t>RTL design</w:t>
+      </w:r>
+      <w:r>
+        <w:t xml:space="preserve">, we took into account the creation of a </w:t>
+      </w:r>
+      <w:r>
+        <w:rPr>
+          <w:b/>
+          <w:bCs/>
+        </w:rPr>
+        <w:t>module containing the logic signals required for system clock handling and PWM duty cycle control.</w:t>
+      </w:r>
+    </w:p>
+    <w:p>
+      <w:pPr>
+        <w:spacing w:line="240" w:lineRule="auto"/>
+        <w:jc w:val="both"/>
+        <w:rPr>
+          <w:b/>
+          <w:bCs/>
+          <w:u w:val="single"/>
+        </w:rPr>
+      </w:pPr>
+      <w:r>
+        <w:rPr>
+          <w:noProof/>
+        </w:rPr>
+        <w:drawing>
+          <wp:inline distT="0" distB="0" distL="0" distR="0" wp14:anchorId="28AF3799" wp14:editId="073DD3E6">
+            <wp:extent cx="3399941" cy="742950"/>
+            <wp:effectExtent l="0" t="0" r="0" b="0"/>
+            <wp:docPr id="961935817" name="Imagen 1"/>
+            <wp:cNvGraphicFramePr>
+              <a:graphicFrameLocks xmlns:a="http://schemas.openxmlformats.org/drawingml/2006/main" noChangeAspect="1"/>
+            </wp:cNvGraphicFramePr>
+            <a:graphic xmlns:a="http://schemas.openxmlformats.org/drawingml/2006/main">
+              <a:graphicData uri="http://schemas.openxmlformats.org/drawingml/2006/picture">
+                <pic:pic xmlns:pic="http://schemas.openxmlformats.org/drawingml/2006/picture">
+                  <pic:nvPicPr>
+                    <pic:cNvPr id="961935817" name=""/>
+                    <pic:cNvPicPr/>
+                  </pic:nvPicPr>
+                  <pic:blipFill>
+                    <a:blip r:embed="rId14"/>
+                    <a:stretch>
+                      <a:fillRect/>
+                    </a:stretch>
+                  </pic:blipFill>
+                  <pic:spPr>
+                    <a:xfrm>
+                      <a:off x="0" y="0"/>
+                      <a:ext cx="3402338" cy="743474"/>
+                    </a:xfrm>
+                    <a:prstGeom prst="rect">
+                      <a:avLst/>
+                    </a:prstGeom>
+                  </pic:spPr>
+                </pic:pic>
+              </a:graphicData>
+            </a:graphic>
+          </wp:inline>
+        </w:drawing>
+      </w:r>
+    </w:p>
+    <w:p>
+      <w:pPr>
+        <w:spacing w:line="240" w:lineRule="auto"/>
+        <w:jc w:val="both"/>
+      </w:pPr>
+      <w:r>
+        <w:t>In this section, we define all local parameters related to counters, widths, steps, and frequencies as variables.</w:t>
+      </w:r>
+    </w:p>
+    <w:p>
+      <w:r>
+        <w:rPr>
+          <w:noProof/>
+        </w:rPr>
+        <w:drawing>
+          <wp:anchor distT="0" distB="0" distL="114300" distR="114300" simplePos="0" relativeHeight="251680768" behindDoc="0" locked="0" layoutInCell="1" allowOverlap="1" wp14:anchorId="0C09016A" wp14:editId="15D00561">
+            <wp:simplePos x="0" y="0"/>
+            <wp:positionH relativeFrom="margin">
+              <wp:align>left</wp:align>
+            </wp:positionH>
+            <wp:positionV relativeFrom="paragraph">
+              <wp:posOffset>2540</wp:posOffset>
+            </wp:positionV>
+            <wp:extent cx="3028950" cy="1424148"/>
+            <wp:effectExtent l="0" t="0" r="0" b="5080"/>
+            <wp:wrapNone/>
+            <wp:docPr id="1866837265" name="Imagen 1"/>
+            <wp:cNvGraphicFramePr>
+              <a:graphicFrameLocks xmlns:a="http://schemas.openxmlformats.org/drawingml/2006/main" noChangeAspect="1"/>
+            </wp:cNvGraphicFramePr>
+            <a:graphic xmlns:a="http://schemas.openxmlformats.org/drawingml/2006/main">
+              <a:graphicData uri="http://schemas.openxmlformats.org/drawingml/2006/picture">
+                <pic:pic xmlns:pic="http://schemas.openxmlformats.org/drawingml/2006/picture">
+                  <pic:nvPicPr>
+                    <pic:cNvPr id="1866837265" name=""/>
+                    <pic:cNvPicPr/>
+                  </pic:nvPicPr>
+                  <pic:blipFill>
+                    <a:blip r:embed="rId15" cstate="print">
+                      <a:extLst>
+                        <a:ext uri="{28A0092B-C50C-407E-A947-70E740481C1C}">
+                          <a14:useLocalDpi xmlns:a14="http://schemas.microsoft.com/office/drawing/2010/main" val="0"/>
+                        </a:ext>
+                      </a:extLst>
+                    </a:blip>
+                    <a:stretch>
+                      <a:fillRect/>
+                    </a:stretch>
+                  </pic:blipFill>
+                  <pic:spPr>
+                    <a:xfrm>
+                      <a:off x="0" y="0"/>
+                      <a:ext cx="3038675" cy="1428721"/>
+                    </a:xfrm>
+                    <a:prstGeom prst="rect">
+                      <a:avLst/>
+                    </a:prstGeom>
+                  </pic:spPr>
+                </pic:pic>
+              </a:graphicData>
+            </a:graphic>
+            <wp14:sizeRelH relativeFrom="page">
+              <wp14:pctWidth>0</wp14:pctWidth>
+            </wp14:sizeRelH>
+            <wp14:sizeRelV relativeFrom="page">
+              <wp14:pctHeight>0</wp14:pctHeight>
+            </wp14:sizeRelV>
+          </wp:anchor>
+        </w:drawing>
+      </w:r>
+    </w:p>
     <w:p/>
-    <w:p>
-      <w:pPr>
-        <w:rPr>
-          <w:u w:val="single"/>
-        </w:rPr>
-      </w:pPr>
+    <w:p/>
+    <w:p/>
+    <w:p/>
+    <w:p>
+      <w:pPr>
+        <w:spacing w:line="240" w:lineRule="auto"/>
+        <w:jc w:val="both"/>
+      </w:pPr>
+      <w:r>
+        <w:t>In this section, we implement the sequential logic that handles tick counting and increments the PWM counter.</w:t>
+      </w:r>
+    </w:p>
+    <w:p>
+      <w:r>
+        <w:rPr>
+          <w:noProof/>
+        </w:rPr>
+        <w:drawing>
+          <wp:anchor distT="0" distB="0" distL="114300" distR="114300" simplePos="0" relativeHeight="251681792" behindDoc="0" locked="0" layoutInCell="1" allowOverlap="1" wp14:anchorId="7EB1506D" wp14:editId="208F282E">
+            <wp:simplePos x="0" y="0"/>
+            <wp:positionH relativeFrom="column">
+              <wp:align>left</wp:align>
+            </wp:positionH>
+            <wp:positionV relativeFrom="paragraph">
+              <wp:posOffset>3175</wp:posOffset>
+            </wp:positionV>
+            <wp:extent cx="3534477" cy="1409700"/>
+            <wp:effectExtent l="0" t="0" r="8890" b="0"/>
+            <wp:wrapNone/>
+            <wp:docPr id="1733700092" name="Imagen 1"/>
+            <wp:cNvGraphicFramePr>
+              <a:graphicFrameLocks xmlns:a="http://schemas.openxmlformats.org/drawingml/2006/main" noChangeAspect="1"/>
+            </wp:cNvGraphicFramePr>
+            <a:graphic xmlns:a="http://schemas.openxmlformats.org/drawingml/2006/main">
+              <a:graphicData uri="http://schemas.openxmlformats.org/drawingml/2006/picture">
+                <pic:pic xmlns:pic="http://schemas.openxmlformats.org/drawingml/2006/picture">
+                  <pic:nvPicPr>
+                    <pic:cNvPr id="1733700092" name=""/>
+                    <pic:cNvPicPr/>
+                  </pic:nvPicPr>
+                  <pic:blipFill>
+                    <a:blip r:embed="rId16" cstate="print">
+                      <a:extLst>
+                        <a:ext uri="{28A0092B-C50C-407E-A947-70E740481C1C}">
+                          <a14:useLocalDpi xmlns:a14="http://schemas.microsoft.com/office/drawing/2010/main" val="0"/>
+                        </a:ext>
+                      </a:extLst>
+                    </a:blip>
+                    <a:stretch>
+                      <a:fillRect/>
+                    </a:stretch>
+                  </pic:blipFill>
+                  <pic:spPr>
+                    <a:xfrm>
+                      <a:off x="0" y="0"/>
+                      <a:ext cx="3534477" cy="1409700"/>
+                    </a:xfrm>
+                    <a:prstGeom prst="rect">
+                      <a:avLst/>
+                    </a:prstGeom>
+                  </pic:spPr>
+                </pic:pic>
+              </a:graphicData>
+            </a:graphic>
+            <wp14:sizeRelH relativeFrom="page">
+              <wp14:pctWidth>0</wp14:pctWidth>
+            </wp14:sizeRelH>
+            <wp14:sizeRelV relativeFrom="page">
+              <wp14:pctHeight>0</wp14:pctHeight>
+            </wp14:sizeRelV>
+          </wp:anchor>
+        </w:drawing>
+      </w:r>
+    </w:p>
+    <w:p/>
+    <w:p/>
+    <w:p/>
+    <w:p/>
+    <w:p/>
+    <w:p>
+      <w:r>
+        <w:t>This section includes the combinational logic that performs the comparison to generate the PWM output.</w:t>
+      </w:r>
+    </w:p>
+    <w:p>
+      <w:r>
+        <w:rPr>
+          <w:noProof/>
+        </w:rPr>
+        <w:drawing>
+          <wp:inline distT="0" distB="0" distL="0" distR="0" wp14:anchorId="38563E40" wp14:editId="04B10037">
+            <wp:extent cx="3550920" cy="845820"/>
+            <wp:effectExtent l="0" t="0" r="0" b="7620"/>
+            <wp:docPr id="1634702815" name="Imagen 1"/>
+            <wp:cNvGraphicFramePr>
+              <a:graphicFrameLocks xmlns:a="http://schemas.openxmlformats.org/drawingml/2006/main" noChangeAspect="1"/>
+            </wp:cNvGraphicFramePr>
+            <a:graphic xmlns:a="http://schemas.openxmlformats.org/drawingml/2006/main">
+              <a:graphicData uri="http://schemas.openxmlformats.org/drawingml/2006/picture">
+                <pic:pic xmlns:pic="http://schemas.openxmlformats.org/drawingml/2006/picture">
+                  <pic:nvPicPr>
+                    <pic:cNvPr id="1634702815" name=""/>
+                    <pic:cNvPicPr/>
+                  </pic:nvPicPr>
+                  <pic:blipFill>
+                    <a:blip r:embed="rId17"/>
+                    <a:stretch>
+                      <a:fillRect/>
+                    </a:stretch>
+                  </pic:blipFill>
+                  <pic:spPr>
+                    <a:xfrm>
+                      <a:off x="0" y="0"/>
+                      <a:ext cx="3550920" cy="845820"/>
+                    </a:xfrm>
+                    <a:prstGeom prst="rect">
+                      <a:avLst/>
+                    </a:prstGeom>
+                  </pic:spPr>
+                </pic:pic>
+              </a:graphicData>
+            </a:graphic>
+          </wp:inline>
+        </w:drawing>
+      </w:r>
+    </w:p>
+    <w:p/>
+    <w:p>
+      <w:pPr>
+        <w:pStyle w:val="Ttulo2"/>
+        <w:rPr>
+          <w:rFonts w:asciiTheme="minorHAnsi" w:hAnsiTheme="minorHAnsi" w:cstheme="minorHAnsi"/>
+          <w:b/>
+          <w:bCs/>
+          <w:color w:val="000000" w:themeColor="text1"/>
+          <w:sz w:val="24"/>
+          <w:szCs w:val="24"/>
+        </w:rPr>
+      </w:pPr>
+      <w:r>
+        <w:rPr>
+          <w:rFonts w:asciiTheme="minorHAnsi" w:hAnsiTheme="minorHAnsi" w:cstheme="minorHAnsi"/>
+          <w:b/>
+          <w:bCs/>
+          <w:color w:val="000000" w:themeColor="text1"/>
+          <w:sz w:val="24"/>
+          <w:szCs w:val="24"/>
+        </w:rPr>
+        <w:t>9</w:t>
+      </w:r>
+      <w:r>
+        <w:rPr>
+          <w:rFonts w:asciiTheme="minorHAnsi" w:hAnsiTheme="minorHAnsi" w:cstheme="minorHAnsi"/>
+          <w:b/>
+          <w:bCs/>
+          <w:color w:val="000000" w:themeColor="text1"/>
+          <w:sz w:val="24"/>
+          <w:szCs w:val="24"/>
+        </w:rPr>
+        <w:t xml:space="preserve">.- </w:t>
+      </w:r>
+      <w:r>
+        <w:rPr>
+          <w:rFonts w:asciiTheme="minorHAnsi" w:hAnsiTheme="minorHAnsi" w:cstheme="minorHAnsi"/>
+          <w:b/>
+          <w:bCs/>
+          <w:color w:val="000000" w:themeColor="text1"/>
+          <w:sz w:val="24"/>
+          <w:szCs w:val="24"/>
+        </w:rPr>
+        <w:t>WAVEFORM</w:t>
+      </w:r>
+    </w:p>
+    <w:p>
+      <w:pPr>
+        <w:spacing w:line="360" w:lineRule="auto"/>
+        <w:jc w:val="both"/>
+      </w:pPr>
+      <w:r>
+        <w:rPr>
+          <w:noProof/>
+        </w:rPr>
+        <w:drawing>
+          <wp:anchor distT="0" distB="0" distL="114300" distR="114300" simplePos="0" relativeHeight="251683840" behindDoc="0" locked="0" layoutInCell="1" allowOverlap="1" wp14:anchorId="370CA0A5" wp14:editId="274A0B61">
+            <wp:simplePos x="0" y="0"/>
+            <wp:positionH relativeFrom="column">
+              <wp:align>left</wp:align>
+            </wp:positionH>
+            <wp:positionV relativeFrom="paragraph">
+              <wp:posOffset>542925</wp:posOffset>
+            </wp:positionV>
+            <wp:extent cx="3441700" cy="1800519"/>
+            <wp:effectExtent l="0" t="0" r="6350" b="9525"/>
+            <wp:wrapNone/>
+            <wp:docPr id="886583843" name="Imagen 1"/>
+            <wp:cNvGraphicFramePr>
+              <a:graphicFrameLocks xmlns:a="http://schemas.openxmlformats.org/drawingml/2006/main" noChangeAspect="1"/>
+            </wp:cNvGraphicFramePr>
+            <a:graphic xmlns:a="http://schemas.openxmlformats.org/drawingml/2006/main">
+              <a:graphicData uri="http://schemas.openxmlformats.org/drawingml/2006/picture">
+                <pic:pic xmlns:pic="http://schemas.openxmlformats.org/drawingml/2006/picture">
+                  <pic:nvPicPr>
+                    <pic:cNvPr id="886583843" name=""/>
+                    <pic:cNvPicPr/>
+                  </pic:nvPicPr>
+                  <pic:blipFill>
+                    <a:blip r:embed="rId18">
+                      <a:extLst>
+                        <a:ext uri="{28A0092B-C50C-407E-A947-70E740481C1C}">
+                          <a14:useLocalDpi xmlns:a14="http://schemas.microsoft.com/office/drawing/2010/main" val="0"/>
+                        </a:ext>
+                      </a:extLst>
+                    </a:blip>
+                    <a:stretch>
+                      <a:fillRect/>
+                    </a:stretch>
+                  </pic:blipFill>
+                  <pic:spPr>
+                    <a:xfrm>
+                      <a:off x="0" y="0"/>
+                      <a:ext cx="3443386" cy="1801401"/>
+                    </a:xfrm>
+                    <a:prstGeom prst="rect">
+                      <a:avLst/>
+                    </a:prstGeom>
+                  </pic:spPr>
+                </pic:pic>
+              </a:graphicData>
+            </a:graphic>
+            <wp14:sizeRelH relativeFrom="page">
+              <wp14:pctWidth>0</wp14:pctWidth>
+            </wp14:sizeRelH>
+            <wp14:sizeRelV relativeFrom="page">
+              <wp14:pctHeight>0</wp14:pctHeight>
+            </wp14:sizeRelV>
+          </wp:anchor>
+        </w:drawing>
+      </w:r>
+      <w:r>
+        <w:t>In this case we</w:t>
+      </w:r>
+      <w:r>
+        <w:t xml:space="preserve"> saw this in the “Run Simulation” in the tool </w:t>
+      </w:r>
+      <w:r>
+        <w:rPr>
+          <w:b/>
+          <w:bCs/>
+        </w:rPr>
+        <w:t>“Vivado”</w:t>
+      </w:r>
+      <w:r>
+        <w:rPr>
+          <w:b/>
+          <w:bCs/>
+        </w:rPr>
+        <w:t>.</w:t>
+      </w:r>
+    </w:p>
+    <w:p/>
+    <w:p/>
+    <w:p/>
+    <w:p/>
+    <w:p/>
+    <w:p/>
+    <w:p/>
+    <w:p>
+      <w:pPr>
+        <w:spacing w:line="360" w:lineRule="auto"/>
+        <w:jc w:val="both"/>
+      </w:pPr>
+      <w:r>
+        <w:t>Also was possible saw a representation of the schematic RTL, but in this case for the “Team13” did the Design Verification for this RTL stage.</w:t>
+      </w:r>
+    </w:p>
+    <w:p>
+      <w:pPr>
+        <w:pStyle w:val="Ttulo2"/>
+        <w:rPr>
+          <w:rFonts w:asciiTheme="minorHAnsi" w:hAnsiTheme="minorHAnsi" w:cstheme="minorHAnsi"/>
+          <w:b/>
+          <w:bCs/>
+          <w:color w:val="000000" w:themeColor="text1"/>
+          <w:sz w:val="24"/>
+          <w:szCs w:val="24"/>
+        </w:rPr>
+      </w:pPr>
+      <w:r>
+        <w:rPr>
+          <w:noProof/>
+        </w:rPr>
+        <w:lastRenderedPageBreak/>
+        <w:drawing>
+          <wp:anchor distT="0" distB="0" distL="114300" distR="114300" simplePos="0" relativeHeight="251684864" behindDoc="0" locked="0" layoutInCell="1" allowOverlap="1" wp14:anchorId="70C4468B" wp14:editId="281C0834">
+            <wp:simplePos x="0" y="0"/>
+            <wp:positionH relativeFrom="margin">
+              <wp:align>center</wp:align>
+            </wp:positionH>
+            <wp:positionV relativeFrom="paragraph">
+              <wp:posOffset>279400</wp:posOffset>
+            </wp:positionV>
+            <wp:extent cx="7473950" cy="2709214"/>
+            <wp:effectExtent l="19050" t="19050" r="12700" b="15240"/>
+            <wp:wrapNone/>
+            <wp:docPr id="244966498" name="Imagen 1"/>
+            <wp:cNvGraphicFramePr>
+              <a:graphicFrameLocks xmlns:a="http://schemas.openxmlformats.org/drawingml/2006/main" noChangeAspect="1"/>
+            </wp:cNvGraphicFramePr>
+            <a:graphic xmlns:a="http://schemas.openxmlformats.org/drawingml/2006/main">
+              <a:graphicData uri="http://schemas.openxmlformats.org/drawingml/2006/picture">
+                <pic:pic xmlns:pic="http://schemas.openxmlformats.org/drawingml/2006/picture">
+                  <pic:nvPicPr>
+                    <pic:cNvPr id="244966498" name=""/>
+                    <pic:cNvPicPr/>
+                  </pic:nvPicPr>
+                  <pic:blipFill>
+                    <a:blip r:embed="rId19">
+                      <a:extLst>
+                        <a:ext uri="{28A0092B-C50C-407E-A947-70E740481C1C}">
+                          <a14:useLocalDpi xmlns:a14="http://schemas.microsoft.com/office/drawing/2010/main" val="0"/>
+                        </a:ext>
+                      </a:extLst>
+                    </a:blip>
+                    <a:stretch>
+                      <a:fillRect/>
+                    </a:stretch>
+                  </pic:blipFill>
+                  <pic:spPr>
+                    <a:xfrm>
+                      <a:off x="0" y="0"/>
+                      <a:ext cx="7473950" cy="2709214"/>
+                    </a:xfrm>
+                    <a:prstGeom prst="rect">
+                      <a:avLst/>
+                    </a:prstGeom>
+                    <a:ln>
+                      <a:solidFill>
+                        <a:schemeClr val="tx1"/>
+                      </a:solidFill>
+                    </a:ln>
+                  </pic:spPr>
+                </pic:pic>
+              </a:graphicData>
+            </a:graphic>
+            <wp14:sizeRelH relativeFrom="page">
+              <wp14:pctWidth>0</wp14:pctWidth>
+            </wp14:sizeRelH>
+            <wp14:sizeRelV relativeFrom="page">
+              <wp14:pctHeight>0</wp14:pctHeight>
+            </wp14:sizeRelV>
+          </wp:anchor>
+        </w:drawing>
+      </w:r>
+      <w:r>
+        <w:rPr>
+          <w:rFonts w:asciiTheme="minorHAnsi" w:hAnsiTheme="minorHAnsi" w:cstheme="minorHAnsi"/>
+          <w:b/>
+          <w:bCs/>
+          <w:color w:val="000000" w:themeColor="text1"/>
+          <w:sz w:val="24"/>
+          <w:szCs w:val="24"/>
+        </w:rPr>
+        <w:t xml:space="preserve"> </w:t>
+      </w:r>
+      <w:r>
+        <w:rPr>
+          <w:rFonts w:asciiTheme="minorHAnsi" w:hAnsiTheme="minorHAnsi" w:cstheme="minorHAnsi"/>
+          <w:b/>
+          <w:bCs/>
+          <w:color w:val="000000" w:themeColor="text1"/>
+          <w:sz w:val="24"/>
+          <w:szCs w:val="24"/>
+        </w:rPr>
+        <w:t>9</w:t>
+      </w:r>
+      <w:r>
+        <w:rPr>
+          <w:rFonts w:asciiTheme="minorHAnsi" w:hAnsiTheme="minorHAnsi" w:cstheme="minorHAnsi"/>
+          <w:b/>
+          <w:bCs/>
+          <w:color w:val="000000" w:themeColor="text1"/>
+          <w:sz w:val="24"/>
+          <w:szCs w:val="24"/>
+        </w:rPr>
+        <w:t xml:space="preserve">.- </w:t>
+      </w:r>
+      <w:r>
+        <w:rPr>
+          <w:rFonts w:asciiTheme="minorHAnsi" w:hAnsiTheme="minorHAnsi" w:cstheme="minorHAnsi"/>
+          <w:b/>
+          <w:bCs/>
+          <w:color w:val="000000" w:themeColor="text1"/>
+          <w:sz w:val="24"/>
+          <w:szCs w:val="24"/>
+        </w:rPr>
+        <w:t>SCHEMATIC</w:t>
+      </w:r>
     </w:p>
     <w:p/>
     <w:p/>
@@ -4777,35 +6112,101 @@
     <w:p/>
     <w:p/>
     <w:p/>
-    <w:p/>
-    <w:p/>
-    <w:p/>
-    <w:p/>
-    <w:p/>
-    <w:p/>
-    <w:p/>
-    <w:p/>
-    <w:p/>
-    <w:p/>
-    <w:p/>
-    <w:p/>
-    <w:p/>
-    <w:p/>
-    <w:p/>
-    <w:p/>
+    <w:p>
+      <w:pPr>
+        <w:pStyle w:val="Ttulo2"/>
+        <w:rPr>
+          <w:rFonts w:asciiTheme="minorHAnsi" w:hAnsiTheme="minorHAnsi" w:cstheme="minorHAnsi"/>
+          <w:b/>
+          <w:bCs/>
+          <w:color w:val="000000" w:themeColor="text1"/>
+          <w:sz w:val="24"/>
+          <w:szCs w:val="24"/>
+        </w:rPr>
+      </w:pPr>
+      <w:r>
+        <w:rPr>
+          <w:rFonts w:asciiTheme="minorHAnsi" w:hAnsiTheme="minorHAnsi" w:cstheme="minorHAnsi"/>
+          <w:b/>
+          <w:bCs/>
+          <w:color w:val="000000" w:themeColor="text1"/>
+          <w:sz w:val="24"/>
+          <w:szCs w:val="24"/>
+        </w:rPr>
+        <w:t>10</w:t>
+      </w:r>
+      <w:r>
+        <w:rPr>
+          <w:rFonts w:asciiTheme="minorHAnsi" w:hAnsiTheme="minorHAnsi" w:cstheme="minorHAnsi"/>
+          <w:b/>
+          <w:bCs/>
+          <w:color w:val="000000" w:themeColor="text1"/>
+          <w:sz w:val="24"/>
+          <w:szCs w:val="24"/>
+        </w:rPr>
+        <w:t xml:space="preserve">.- </w:t>
+      </w:r>
+      <w:r>
+        <w:rPr>
+          <w:rFonts w:asciiTheme="minorHAnsi" w:hAnsiTheme="minorHAnsi" w:cstheme="minorHAnsi"/>
+          <w:b/>
+          <w:bCs/>
+          <w:color w:val="000000" w:themeColor="text1"/>
+          <w:sz w:val="24"/>
+          <w:szCs w:val="24"/>
+        </w:rPr>
+        <w:t>GITHUB</w:t>
+      </w:r>
+    </w:p>
     <w:p>
       <w:pPr>
         <w:jc w:val="both"/>
-      </w:pPr>
+        <w:rPr>
+          <w:b/>
+          <w:bCs/>
+          <w:i/>
+          <w:iCs/>
+          <w:u w:val="single"/>
+        </w:rPr>
+      </w:pPr>
+      <w:hyperlink r:id="rId20" w:history="1">
+        <w:r>
+          <w:rPr>
+            <w:rStyle w:val="Hipervnculo"/>
+            <w:b/>
+            <w:bCs/>
+            <w:i/>
+            <w:iCs/>
+          </w:rPr>
+          <w:t>https://github.com/CeicGitHub/Fundamentals_Of_Digital_Design_FPGA_5/tree/Project_Pwm8bit500hz</w:t>
+        </w:r>
+      </w:hyperlink>
     </w:p>
     <w:p>
       <w:pPr>
         <w:jc w:val="both"/>
+        <w:rPr>
+          <w:b/>
+          <w:bCs/>
+          <w:i/>
+          <w:iCs/>
+          <w:u w:val="single"/>
+        </w:rPr>
+      </w:pPr>
+    </w:p>
+    <w:p>
+      <w:pPr>
+        <w:jc w:val="both"/>
+      </w:pPr>
+    </w:p>
+    <w:p>
+      <w:pPr>
+        <w:jc w:val="both"/>
       </w:pPr>
     </w:p>
     <w:sectPr>
-      <w:headerReference w:type="default" r:id="rId17"/>
-      <w:footerReference w:type="default" r:id="rId18"/>
+      <w:headerReference w:type="default" r:id="rId21"/>
+      <w:footerReference w:type="default" r:id="rId22"/>
       <w:pgSz w:w="12240" w:h="15840"/>
       <w:pgMar w:top="1440" w:right="1440" w:bottom="1440" w:left="1440" w:header="720" w:footer="720" w:gutter="0"/>
       <w:cols w:num="2" w:space="720"/>
@@ -4813,42 +6214,6 @@
     </w:sectPr>
   </w:body>
 </w:document>
-</file>
-
-<file path=word/comments.xml><?xml version="1.0" encoding="utf-8"?>
-<w:comments xmlns:wpc="http://schemas.microsoft.com/office/word/2010/wordprocessingCanvas" xmlns:cx="http://schemas.microsoft.com/office/drawing/2014/chartex" xmlns:cx1="http://schemas.microsoft.com/office/drawing/2015/9/8/chartex" xmlns:cx2="http://schemas.microsoft.com/office/drawing/2015/10/21/chartex" xmlns:cx3="http://schemas.microsoft.com/office/drawing/2016/5/9/chartex" xmlns:cx4="http://schemas.microsoft.com/office/drawing/2016/5/10/chartex" xmlns:cx5="http://schemas.microsoft.com/office/drawing/2016/5/11/chartex" xmlns:cx6="http://schemas.microsoft.com/office/drawing/2016/5/12/chartex" xmlns:cx7="http://schemas.microsoft.com/office/drawing/2016/5/13/chartex" xmlns:cx8="http://schemas.microsoft.com/office/drawing/2016/5/14/chartex" xmlns:mc="http://schemas.openxmlformats.org/markup-compatibility/2006" xmlns:aink="http://schemas.microsoft.com/office/drawing/2016/ink" xmlns:am3d="http://schemas.microsoft.com/office/drawing/2017/model3d" xmlns:o="urn:schemas-microsoft-com:office:office" xmlns:oel="http://schemas.microsoft.com/office/2019/extlst" xmlns:r="http://schemas.openxmlformats.org/officeDocument/2006/relationships" xmlns:m="http://schemas.openxmlformats.org/officeDocument/2006/math" xmlns:v="urn:schemas-microsoft-com:vml" xmlns:wp14="http://schemas.microsoft.com/office/word/2010/wordprocessingDrawing" xmlns:wp="http://schemas.openxmlformats.org/drawingml/2006/wordprocessingDrawing" xmlns:w10="urn:schemas-microsoft-com:office:word" xmlns:w="http://schemas.openxmlformats.org/wordprocessingml/2006/main" xmlns:w14="http://schemas.microsoft.com/office/word/2010/wordml" xmlns:w15="http://schemas.microsoft.com/office/word/2012/wordml" xmlns:w16cex="http://schemas.microsoft.com/office/word/2018/wordml/cex" xmlns:w16cid="http://schemas.microsoft.com/office/word/2016/wordml/cid" xmlns:w16="http://schemas.microsoft.com/office/word/2018/wordml" xmlns:w16du="http://schemas.microsoft.com/office/word/2023/wordml/word16du" xmlns:w16sdtdh="http://schemas.microsoft.com/office/word/2020/wordml/sdtdatahash" xmlns:w16sdtfl="http://schemas.microsoft.com/office/word/2024/wordml/sdtformatlock" xmlns:w16se="http://schemas.microsoft.com/office/word/2015/wordml/symex" xmlns:wpg="http://schemas.microsoft.com/office/word/2010/wordprocessingGroup" xmlns:wpi="http://schemas.microsoft.com/office/word/2010/wordprocessingInk" xmlns:wne="http://schemas.microsoft.com/office/word/2006/wordml" xmlns:wps="http://schemas.microsoft.com/office/word/2010/wordprocessingShape" mc:Ignorable="w14 w15 w16se w16cid w16 w16cex w16sdtdh w16sdtfl w16du wp14">
-  <w:comment w:id="0" w:author="Cesar Eduardo Inda Ceniceros" w:date="2025-06-30T17:47:00Z" w:initials="CI">
-    <w:p>
-      <w:pPr>
-        <w:pStyle w:val="Textocomentario"/>
-      </w:pPr>
-      <w:r>
-        <w:rPr>
-          <w:rStyle w:val="Refdecomentario"/>
-        </w:rPr>
-        <w:annotationRef/>
-      </w:r>
-    </w:p>
-  </w:comment>
-</w:comments>
-</file>
-
-<file path=word/commentsExtended.xml><?xml version="1.0" encoding="utf-8"?>
-<w15:commentsEx xmlns:wpc="http://schemas.microsoft.com/office/word/2010/wordprocessingCanvas" xmlns:cx="http://schemas.microsoft.com/office/drawing/2014/chartex" xmlns:cx1="http://schemas.microsoft.com/office/drawing/2015/9/8/chartex" xmlns:cx2="http://schemas.microsoft.com/office/drawing/2015/10/21/chartex" xmlns:cx3="http://schemas.microsoft.com/office/drawing/2016/5/9/chartex" xmlns:cx4="http://schemas.microsoft.com/office/drawing/2016/5/10/chartex" xmlns:cx5="http://schemas.microsoft.com/office/drawing/2016/5/11/chartex" xmlns:cx6="http://schemas.microsoft.com/office/drawing/2016/5/12/chartex" xmlns:cx7="http://schemas.microsoft.com/office/drawing/2016/5/13/chartex" xmlns:cx8="http://schemas.microsoft.com/office/drawing/2016/5/14/chartex" xmlns:mc="http://schemas.openxmlformats.org/markup-compatibility/2006" xmlns:aink="http://schemas.microsoft.com/office/drawing/2016/ink" xmlns:am3d="http://schemas.microsoft.com/office/drawing/2017/model3d" xmlns:o="urn:schemas-microsoft-com:office:office" xmlns:oel="http://schemas.microsoft.com/office/2019/extlst" xmlns:r="http://schemas.openxmlformats.org/officeDocument/2006/relationships" xmlns:m="http://schemas.openxmlformats.org/officeDocument/2006/math" xmlns:v="urn:schemas-microsoft-com:vml" xmlns:wp14="http://schemas.microsoft.com/office/word/2010/wordprocessingDrawing" xmlns:wp="http://schemas.openxmlformats.org/drawingml/2006/wordprocessingDrawing" xmlns:w10="urn:schemas-microsoft-com:office:word" xmlns:w="http://schemas.openxmlformats.org/wordprocessingml/2006/main" xmlns:w14="http://schemas.microsoft.com/office/word/2010/wordml" xmlns:w15="http://schemas.microsoft.com/office/word/2012/wordml" xmlns:w16cex="http://schemas.microsoft.com/office/word/2018/wordml/cex" xmlns:w16cid="http://schemas.microsoft.com/office/word/2016/wordml/cid" xmlns:w16="http://schemas.microsoft.com/office/word/2018/wordml" xmlns:w16du="http://schemas.microsoft.com/office/word/2023/wordml/word16du" xmlns:w16sdtdh="http://schemas.microsoft.com/office/word/2020/wordml/sdtdatahash" xmlns:w16sdtfl="http://schemas.microsoft.com/office/word/2024/wordml/sdtformatlock" xmlns:w16se="http://schemas.microsoft.com/office/word/2015/wordml/symex" xmlns:wpg="http://schemas.microsoft.com/office/word/2010/wordprocessingGroup" xmlns:wpi="http://schemas.microsoft.com/office/word/2010/wordprocessingInk" xmlns:wne="http://schemas.microsoft.com/office/word/2006/wordml" xmlns:wps="http://schemas.microsoft.com/office/word/2010/wordprocessingShape" mc:Ignorable="w14 w15 w16se w16cid w16 w16cex w16sdtdh w16sdtfl w16du wp14">
-  <w15:commentEx w15:paraId="5DBB37EC" w15:done="0"/>
-</w15:commentsEx>
-</file>
-
-<file path=word/commentsExtensible.xml><?xml version="1.0" encoding="utf-8"?>
-<w16cex:commentsExtensible xmlns:wpc="http://schemas.microsoft.com/office/word/2010/wordprocessingCanvas" xmlns:cx="http://schemas.microsoft.com/office/drawing/2014/chartex" xmlns:cx1="http://schemas.microsoft.com/office/drawing/2015/9/8/chartex" xmlns:cx2="http://schemas.microsoft.com/office/drawing/2015/10/21/chartex" xmlns:cx3="http://schemas.microsoft.com/office/drawing/2016/5/9/chartex" xmlns:cx4="http://schemas.microsoft.com/office/drawing/2016/5/10/chartex" xmlns:cx5="http://schemas.microsoft.com/office/drawing/2016/5/11/chartex" xmlns:cx6="http://schemas.microsoft.com/office/drawing/2016/5/12/chartex" xmlns:cx7="http://schemas.microsoft.com/office/drawing/2016/5/13/chartex" xmlns:cx8="http://schemas.microsoft.com/office/drawing/2016/5/14/chartex" xmlns:cr="http://schemas.microsoft.com/office/comments/2020/reactions" xmlns:mc="http://schemas.openxmlformats.org/markup-compatibility/2006" xmlns:aink="http://schemas.microsoft.com/office/drawing/2016/ink" xmlns:am3d="http://schemas.microsoft.com/office/drawing/2017/model3d" xmlns:o="urn:schemas-microsoft-com:office:office" xmlns:oel="http://schemas.microsoft.com/office/2019/extlst" xmlns:r="http://schemas.openxmlformats.org/officeDocument/2006/relationships" xmlns:m="http://schemas.openxmlformats.org/officeDocument/2006/math" xmlns:v="urn:schemas-microsoft-com:vml" xmlns:wp14="http://schemas.microsoft.com/office/word/2010/wordprocessingDrawing" xmlns:wp="http://schemas.openxmlformats.org/drawingml/2006/wordprocessingDrawing" xmlns:w10="urn:schemas-microsoft-com:office:word" xmlns:w="http://schemas.openxmlformats.org/wordprocessingml/2006/main" xmlns:w14="http://schemas.microsoft.com/office/word/2010/wordml" xmlns:w15="http://schemas.microsoft.com/office/word/2012/wordml" xmlns:w16cex="http://schemas.microsoft.com/office/word/2018/wordml/cex" xmlns:w16cid="http://schemas.microsoft.com/office/word/2016/wordml/cid" xmlns:w16="http://schemas.microsoft.com/office/word/2018/wordml" xmlns:w16du="http://schemas.microsoft.com/office/word/2023/wordml/word16du" xmlns:w16sdtdh="http://schemas.microsoft.com/office/word/2020/wordml/sdtdatahash" xmlns:w16sdtfl="http://schemas.microsoft.com/office/word/2024/wordml/sdtformatlock" xmlns:w16se="http://schemas.microsoft.com/office/word/2015/wordml/symex" xmlns:wpg="http://schemas.microsoft.com/office/word/2010/wordprocessingGroup" xmlns:wpi="http://schemas.microsoft.com/office/word/2010/wordprocessingInk" xmlns:wne="http://schemas.microsoft.com/office/word/2006/wordml" xmlns:wps="http://schemas.microsoft.com/office/word/2010/wordprocessingShape" mc:Ignorable="w14 w15 w16se w16cid w16 w16cex w16sdtdh w16sdtfl cr w16du wp14">
-  <w16cex:commentExtensible w16cex:durableId="0173C5D4" w16cex:dateUtc="2025-07-01T00:47:00Z"/>
-</w16cex:commentsExtensible>
-</file>
-
-<file path=word/commentsIds.xml><?xml version="1.0" encoding="utf-8"?>
-<w16cid:commentsIds xmlns:wpc="http://schemas.microsoft.com/office/word/2010/wordprocessingCanvas" xmlns:cx="http://schemas.microsoft.com/office/drawing/2014/chartex" xmlns:cx1="http://schemas.microsoft.com/office/drawing/2015/9/8/chartex" xmlns:cx2="http://schemas.microsoft.com/office/drawing/2015/10/21/chartex" xmlns:cx3="http://schemas.microsoft.com/office/drawing/2016/5/9/chartex" xmlns:cx4="http://schemas.microsoft.com/office/drawing/2016/5/10/chartex" xmlns:cx5="http://schemas.microsoft.com/office/drawing/2016/5/11/chartex" xmlns:cx6="http://schemas.microsoft.com/office/drawing/2016/5/12/chartex" xmlns:cx7="http://schemas.microsoft.com/office/drawing/2016/5/13/chartex" xmlns:cx8="http://schemas.microsoft.com/office/drawing/2016/5/14/chartex" xmlns:mc="http://schemas.openxmlformats.org/markup-compatibility/2006" xmlns:aink="http://schemas.microsoft.com/office/drawing/2016/ink" xmlns:am3d="http://schemas.microsoft.com/office/drawing/2017/model3d" xmlns:o="urn:schemas-microsoft-com:office:office" xmlns:oel="http://schemas.microsoft.com/office/2019/extlst" xmlns:r="http://schemas.openxmlformats.org/officeDocument/2006/relationships" xmlns:m="http://schemas.openxmlformats.org/officeDocument/2006/math" xmlns:v="urn:schemas-microsoft-com:vml" xmlns:wp14="http://schemas.microsoft.com/office/word/2010/wordprocessingDrawing" xmlns:wp="http://schemas.openxmlformats.org/drawingml/2006/wordprocessingDrawing" xmlns:w10="urn:schemas-microsoft-com:office:word" xmlns:w="http://schemas.openxmlformats.org/wordprocessingml/2006/main" xmlns:w14="http://schemas.microsoft.com/office/word/2010/wordml" xmlns:w15="http://schemas.microsoft.com/office/word/2012/wordml" xmlns:w16cex="http://schemas.microsoft.com/office/word/2018/wordml/cex" xmlns:w16cid="http://schemas.microsoft.com/office/word/2016/wordml/cid" xmlns:w16="http://schemas.microsoft.com/office/word/2018/wordml" xmlns:w16du="http://schemas.microsoft.com/office/word/2023/wordml/word16du" xmlns:w16sdtdh="http://schemas.microsoft.com/office/word/2020/wordml/sdtdatahash" xmlns:w16sdtfl="http://schemas.microsoft.com/office/word/2024/wordml/sdtformatlock" xmlns:w16se="http://schemas.microsoft.com/office/word/2015/wordml/symex" xmlns:wpg="http://schemas.microsoft.com/office/word/2010/wordprocessingGroup" xmlns:wpi="http://schemas.microsoft.com/office/word/2010/wordprocessingInk" xmlns:wne="http://schemas.microsoft.com/office/word/2006/wordml" xmlns:wps="http://schemas.microsoft.com/office/word/2010/wordprocessingShape" mc:Ignorable="w14 w15 w16se w16cid w16 w16cex w16sdtdh w16sdtfl w16du wp14">
-  <w16cid:commentId w16cid:paraId="5DBB37EC" w16cid:durableId="0173C5D4"/>
-</w16cid:commentsIds>
 </file>
 
 <file path=word/endnotes.xml><?xml version="1.0" encoding="utf-8"?>
@@ -4965,7 +6330,7 @@
           <wp:extent cx="1800617" cy="485775"/>
           <wp:effectExtent l="0" t="0" r="0" b="0"/>
           <wp:wrapNone/>
-          <wp:docPr id="10" name="Picture 9" descr="A blue and black logo&#10;&#10;AI-generated content may be incorrect.">
+          <wp:docPr id="1455831700" name="Picture 9" descr="A blue and black logo&#10;&#10;AI-generated content may be incorrect.">
             <a:extLst xmlns:a="http://schemas.openxmlformats.org/drawingml/2006/main">
               <a:ext uri="{FF2B5EF4-FFF2-40B4-BE49-F238E27FC236}">
                 <a16:creationId xmlns:a16="http://schemas.microsoft.com/office/drawing/2014/main" id="{760E6E39-CDBF-CA76-EC86-D51FA4CD9EF7}"/>
@@ -5039,7 +6404,7 @@
           <wp:extent cx="2728595" cy="566522"/>
           <wp:effectExtent l="0" t="0" r="0" b="0"/>
           <wp:wrapNone/>
-          <wp:docPr id="5" name="Picture 4" descr="A black background with red text">
+          <wp:docPr id="1158642144" name="Picture 4" descr="A black background with red text">
             <a:extLst xmlns:a="http://schemas.openxmlformats.org/drawingml/2006/main">
               <a:ext uri="{FF2B5EF4-FFF2-40B4-BE49-F238E27FC236}">
                 <a16:creationId xmlns:a16="http://schemas.microsoft.com/office/drawing/2014/main" id="{45AB59C4-FC91-9178-D2D4-7C137839514C}"/>
@@ -5124,7 +6489,7 @@
         <v:path o:extrusionok="f" gradientshapeok="t" o:connecttype="rect"/>
         <o:lock v:ext="edit" aspectratio="t"/>
       </v:shapetype>
-      <v:shape id="_x0000_i1032" type="#_x0000_t75" style="width:19.7pt;height:10.85pt;visibility:visible;mso-wrap-style:square" o:bullet="t">
+      <v:shape id="_x0000_i1138" type="#_x0000_t75" style="width:19.8pt;height:10.8pt;visibility:visible;mso-wrap-style:square" o:bullet="t">
         <v:imagedata r:id="rId1" o:title=""/>
       </v:shape>
     </w:pict>
@@ -5365,6 +6730,119 @@
     </w:lvl>
   </w:abstractNum>
   <w:abstractNum w:abstractNumId="2" w15:restartNumberingAfterBreak="0">
+    <w:nsid w:val="0D2740F3"/>
+    <w:multiLevelType w:val="hybridMultilevel"/>
+    <w:tmpl w:val="FB582C40"/>
+    <w:lvl w:ilvl="0" w:tplc="04090001">
+      <w:start w:val="1"/>
+      <w:numFmt w:val="bullet"/>
+      <w:lvlText w:val=""/>
+      <w:lvlJc w:val="left"/>
+      <w:pPr>
+        <w:ind w:left="720" w:hanging="360"/>
+      </w:pPr>
+      <w:rPr>
+        <w:rFonts w:ascii="Symbol" w:hAnsi="Symbol" w:hint="default"/>
+      </w:rPr>
+    </w:lvl>
+    <w:lvl w:ilvl="1" w:tplc="04090003" w:tentative="1">
+      <w:start w:val="1"/>
+      <w:numFmt w:val="bullet"/>
+      <w:lvlText w:val="o"/>
+      <w:lvlJc w:val="left"/>
+      <w:pPr>
+        <w:ind w:left="1440" w:hanging="360"/>
+      </w:pPr>
+      <w:rPr>
+        <w:rFonts w:ascii="Courier New" w:hAnsi="Courier New" w:cs="Courier New" w:hint="default"/>
+      </w:rPr>
+    </w:lvl>
+    <w:lvl w:ilvl="2" w:tplc="04090005" w:tentative="1">
+      <w:start w:val="1"/>
+      <w:numFmt w:val="bullet"/>
+      <w:lvlText w:val=""/>
+      <w:lvlJc w:val="left"/>
+      <w:pPr>
+        <w:ind w:left="2160" w:hanging="360"/>
+      </w:pPr>
+      <w:rPr>
+        <w:rFonts w:ascii="Wingdings" w:hAnsi="Wingdings" w:hint="default"/>
+      </w:rPr>
+    </w:lvl>
+    <w:lvl w:ilvl="3" w:tplc="04090001" w:tentative="1">
+      <w:start w:val="1"/>
+      <w:numFmt w:val="bullet"/>
+      <w:lvlText w:val=""/>
+      <w:lvlJc w:val="left"/>
+      <w:pPr>
+        <w:ind w:left="2880" w:hanging="360"/>
+      </w:pPr>
+      <w:rPr>
+        <w:rFonts w:ascii="Symbol" w:hAnsi="Symbol" w:hint="default"/>
+      </w:rPr>
+    </w:lvl>
+    <w:lvl w:ilvl="4" w:tplc="04090003" w:tentative="1">
+      <w:start w:val="1"/>
+      <w:numFmt w:val="bullet"/>
+      <w:lvlText w:val="o"/>
+      <w:lvlJc w:val="left"/>
+      <w:pPr>
+        <w:ind w:left="3600" w:hanging="360"/>
+      </w:pPr>
+      <w:rPr>
+        <w:rFonts w:ascii="Courier New" w:hAnsi="Courier New" w:cs="Courier New" w:hint="default"/>
+      </w:rPr>
+    </w:lvl>
+    <w:lvl w:ilvl="5" w:tplc="04090005" w:tentative="1">
+      <w:start w:val="1"/>
+      <w:numFmt w:val="bullet"/>
+      <w:lvlText w:val=""/>
+      <w:lvlJc w:val="left"/>
+      <w:pPr>
+        <w:ind w:left="4320" w:hanging="360"/>
+      </w:pPr>
+      <w:rPr>
+        <w:rFonts w:ascii="Wingdings" w:hAnsi="Wingdings" w:hint="default"/>
+      </w:rPr>
+    </w:lvl>
+    <w:lvl w:ilvl="6" w:tplc="04090001" w:tentative="1">
+      <w:start w:val="1"/>
+      <w:numFmt w:val="bullet"/>
+      <w:lvlText w:val=""/>
+      <w:lvlJc w:val="left"/>
+      <w:pPr>
+        <w:ind w:left="5040" w:hanging="360"/>
+      </w:pPr>
+      <w:rPr>
+        <w:rFonts w:ascii="Symbol" w:hAnsi="Symbol" w:hint="default"/>
+      </w:rPr>
+    </w:lvl>
+    <w:lvl w:ilvl="7" w:tplc="04090003" w:tentative="1">
+      <w:start w:val="1"/>
+      <w:numFmt w:val="bullet"/>
+      <w:lvlText w:val="o"/>
+      <w:lvlJc w:val="left"/>
+      <w:pPr>
+        <w:ind w:left="5760" w:hanging="360"/>
+      </w:pPr>
+      <w:rPr>
+        <w:rFonts w:ascii="Courier New" w:hAnsi="Courier New" w:cs="Courier New" w:hint="default"/>
+      </w:rPr>
+    </w:lvl>
+    <w:lvl w:ilvl="8" w:tplc="04090005" w:tentative="1">
+      <w:start w:val="1"/>
+      <w:numFmt w:val="bullet"/>
+      <w:lvlText w:val=""/>
+      <w:lvlJc w:val="left"/>
+      <w:pPr>
+        <w:ind w:left="6480" w:hanging="360"/>
+      </w:pPr>
+      <w:rPr>
+        <w:rFonts w:ascii="Wingdings" w:hAnsi="Wingdings" w:hint="default"/>
+      </w:rPr>
+    </w:lvl>
+  </w:abstractNum>
+  <w:abstractNum w:abstractNumId="3" w15:restartNumberingAfterBreak="0">
     <w:nsid w:val="14A1205E"/>
     <w:multiLevelType w:val="multilevel"/>
     <w:tmpl w:val="B6183690"/>
@@ -5513,7 +6991,7 @@
       </w:rPr>
     </w:lvl>
   </w:abstractNum>
-  <w:abstractNum w:abstractNumId="3" w15:restartNumberingAfterBreak="0">
+  <w:abstractNum w:abstractNumId="4" w15:restartNumberingAfterBreak="0">
     <w:nsid w:val="168764A9"/>
     <w:multiLevelType w:val="multilevel"/>
     <w:tmpl w:val="04C07C8A"/>
@@ -5662,7 +7140,120 @@
       </w:rPr>
     </w:lvl>
   </w:abstractNum>
-  <w:abstractNum w:abstractNumId="4" w15:restartNumberingAfterBreak="0">
+  <w:abstractNum w:abstractNumId="5" w15:restartNumberingAfterBreak="0">
+    <w:nsid w:val="18331C68"/>
+    <w:multiLevelType w:val="hybridMultilevel"/>
+    <w:tmpl w:val="F65E189A"/>
+    <w:lvl w:ilvl="0" w:tplc="04090001">
+      <w:start w:val="1"/>
+      <w:numFmt w:val="bullet"/>
+      <w:lvlText w:val=""/>
+      <w:lvlJc w:val="left"/>
+      <w:pPr>
+        <w:ind w:left="1800" w:hanging="360"/>
+      </w:pPr>
+      <w:rPr>
+        <w:rFonts w:ascii="Symbol" w:hAnsi="Symbol" w:hint="default"/>
+      </w:rPr>
+    </w:lvl>
+    <w:lvl w:ilvl="1" w:tplc="04090003" w:tentative="1">
+      <w:start w:val="1"/>
+      <w:numFmt w:val="bullet"/>
+      <w:lvlText w:val="o"/>
+      <w:lvlJc w:val="left"/>
+      <w:pPr>
+        <w:ind w:left="2520" w:hanging="360"/>
+      </w:pPr>
+      <w:rPr>
+        <w:rFonts w:ascii="Courier New" w:hAnsi="Courier New" w:cs="Courier New" w:hint="default"/>
+      </w:rPr>
+    </w:lvl>
+    <w:lvl w:ilvl="2" w:tplc="04090005" w:tentative="1">
+      <w:start w:val="1"/>
+      <w:numFmt w:val="bullet"/>
+      <w:lvlText w:val=""/>
+      <w:lvlJc w:val="left"/>
+      <w:pPr>
+        <w:ind w:left="3240" w:hanging="360"/>
+      </w:pPr>
+      <w:rPr>
+        <w:rFonts w:ascii="Wingdings" w:hAnsi="Wingdings" w:hint="default"/>
+      </w:rPr>
+    </w:lvl>
+    <w:lvl w:ilvl="3" w:tplc="04090001" w:tentative="1">
+      <w:start w:val="1"/>
+      <w:numFmt w:val="bullet"/>
+      <w:lvlText w:val=""/>
+      <w:lvlJc w:val="left"/>
+      <w:pPr>
+        <w:ind w:left="3960" w:hanging="360"/>
+      </w:pPr>
+      <w:rPr>
+        <w:rFonts w:ascii="Symbol" w:hAnsi="Symbol" w:hint="default"/>
+      </w:rPr>
+    </w:lvl>
+    <w:lvl w:ilvl="4" w:tplc="04090003" w:tentative="1">
+      <w:start w:val="1"/>
+      <w:numFmt w:val="bullet"/>
+      <w:lvlText w:val="o"/>
+      <w:lvlJc w:val="left"/>
+      <w:pPr>
+        <w:ind w:left="4680" w:hanging="360"/>
+      </w:pPr>
+      <w:rPr>
+        <w:rFonts w:ascii="Courier New" w:hAnsi="Courier New" w:cs="Courier New" w:hint="default"/>
+      </w:rPr>
+    </w:lvl>
+    <w:lvl w:ilvl="5" w:tplc="04090005" w:tentative="1">
+      <w:start w:val="1"/>
+      <w:numFmt w:val="bullet"/>
+      <w:lvlText w:val=""/>
+      <w:lvlJc w:val="left"/>
+      <w:pPr>
+        <w:ind w:left="5400" w:hanging="360"/>
+      </w:pPr>
+      <w:rPr>
+        <w:rFonts w:ascii="Wingdings" w:hAnsi="Wingdings" w:hint="default"/>
+      </w:rPr>
+    </w:lvl>
+    <w:lvl w:ilvl="6" w:tplc="04090001" w:tentative="1">
+      <w:start w:val="1"/>
+      <w:numFmt w:val="bullet"/>
+      <w:lvlText w:val=""/>
+      <w:lvlJc w:val="left"/>
+      <w:pPr>
+        <w:ind w:left="6120" w:hanging="360"/>
+      </w:pPr>
+      <w:rPr>
+        <w:rFonts w:ascii="Symbol" w:hAnsi="Symbol" w:hint="default"/>
+      </w:rPr>
+    </w:lvl>
+    <w:lvl w:ilvl="7" w:tplc="04090003" w:tentative="1">
+      <w:start w:val="1"/>
+      <w:numFmt w:val="bullet"/>
+      <w:lvlText w:val="o"/>
+      <w:lvlJc w:val="left"/>
+      <w:pPr>
+        <w:ind w:left="6840" w:hanging="360"/>
+      </w:pPr>
+      <w:rPr>
+        <w:rFonts w:ascii="Courier New" w:hAnsi="Courier New" w:cs="Courier New" w:hint="default"/>
+      </w:rPr>
+    </w:lvl>
+    <w:lvl w:ilvl="8" w:tplc="04090005" w:tentative="1">
+      <w:start w:val="1"/>
+      <w:numFmt w:val="bullet"/>
+      <w:lvlText w:val=""/>
+      <w:lvlJc w:val="left"/>
+      <w:pPr>
+        <w:ind w:left="7560" w:hanging="360"/>
+      </w:pPr>
+      <w:rPr>
+        <w:rFonts w:ascii="Wingdings" w:hAnsi="Wingdings" w:hint="default"/>
+      </w:rPr>
+    </w:lvl>
+  </w:abstractNum>
+  <w:abstractNum w:abstractNumId="6" w15:restartNumberingAfterBreak="0">
     <w:nsid w:val="1BF65F25"/>
     <w:multiLevelType w:val="multilevel"/>
     <w:tmpl w:val="D09A40F4"/>
@@ -5811,7 +7402,120 @@
       </w:rPr>
     </w:lvl>
   </w:abstractNum>
-  <w:abstractNum w:abstractNumId="5" w15:restartNumberingAfterBreak="0">
+  <w:abstractNum w:abstractNumId="7" w15:restartNumberingAfterBreak="0">
+    <w:nsid w:val="25350FB5"/>
+    <w:multiLevelType w:val="hybridMultilevel"/>
+    <w:tmpl w:val="979EFFA0"/>
+    <w:lvl w:ilvl="0" w:tplc="04090001">
+      <w:start w:val="1"/>
+      <w:numFmt w:val="bullet"/>
+      <w:lvlText w:val=""/>
+      <w:lvlJc w:val="left"/>
+      <w:pPr>
+        <w:ind w:left="1800" w:hanging="360"/>
+      </w:pPr>
+      <w:rPr>
+        <w:rFonts w:ascii="Symbol" w:hAnsi="Symbol" w:hint="default"/>
+      </w:rPr>
+    </w:lvl>
+    <w:lvl w:ilvl="1" w:tplc="04090003" w:tentative="1">
+      <w:start w:val="1"/>
+      <w:numFmt w:val="bullet"/>
+      <w:lvlText w:val="o"/>
+      <w:lvlJc w:val="left"/>
+      <w:pPr>
+        <w:ind w:left="2520" w:hanging="360"/>
+      </w:pPr>
+      <w:rPr>
+        <w:rFonts w:ascii="Courier New" w:hAnsi="Courier New" w:cs="Courier New" w:hint="default"/>
+      </w:rPr>
+    </w:lvl>
+    <w:lvl w:ilvl="2" w:tplc="04090005" w:tentative="1">
+      <w:start w:val="1"/>
+      <w:numFmt w:val="bullet"/>
+      <w:lvlText w:val=""/>
+      <w:lvlJc w:val="left"/>
+      <w:pPr>
+        <w:ind w:left="3240" w:hanging="360"/>
+      </w:pPr>
+      <w:rPr>
+        <w:rFonts w:ascii="Wingdings" w:hAnsi="Wingdings" w:hint="default"/>
+      </w:rPr>
+    </w:lvl>
+    <w:lvl w:ilvl="3" w:tplc="04090001" w:tentative="1">
+      <w:start w:val="1"/>
+      <w:numFmt w:val="bullet"/>
+      <w:lvlText w:val=""/>
+      <w:lvlJc w:val="left"/>
+      <w:pPr>
+        <w:ind w:left="3960" w:hanging="360"/>
+      </w:pPr>
+      <w:rPr>
+        <w:rFonts w:ascii="Symbol" w:hAnsi="Symbol" w:hint="default"/>
+      </w:rPr>
+    </w:lvl>
+    <w:lvl w:ilvl="4" w:tplc="04090003" w:tentative="1">
+      <w:start w:val="1"/>
+      <w:numFmt w:val="bullet"/>
+      <w:lvlText w:val="o"/>
+      <w:lvlJc w:val="left"/>
+      <w:pPr>
+        <w:ind w:left="4680" w:hanging="360"/>
+      </w:pPr>
+      <w:rPr>
+        <w:rFonts w:ascii="Courier New" w:hAnsi="Courier New" w:cs="Courier New" w:hint="default"/>
+      </w:rPr>
+    </w:lvl>
+    <w:lvl w:ilvl="5" w:tplc="04090005" w:tentative="1">
+      <w:start w:val="1"/>
+      <w:numFmt w:val="bullet"/>
+      <w:lvlText w:val=""/>
+      <w:lvlJc w:val="left"/>
+      <w:pPr>
+        <w:ind w:left="5400" w:hanging="360"/>
+      </w:pPr>
+      <w:rPr>
+        <w:rFonts w:ascii="Wingdings" w:hAnsi="Wingdings" w:hint="default"/>
+      </w:rPr>
+    </w:lvl>
+    <w:lvl w:ilvl="6" w:tplc="04090001" w:tentative="1">
+      <w:start w:val="1"/>
+      <w:numFmt w:val="bullet"/>
+      <w:lvlText w:val=""/>
+      <w:lvlJc w:val="left"/>
+      <w:pPr>
+        <w:ind w:left="6120" w:hanging="360"/>
+      </w:pPr>
+      <w:rPr>
+        <w:rFonts w:ascii="Symbol" w:hAnsi="Symbol" w:hint="default"/>
+      </w:rPr>
+    </w:lvl>
+    <w:lvl w:ilvl="7" w:tplc="04090003" w:tentative="1">
+      <w:start w:val="1"/>
+      <w:numFmt w:val="bullet"/>
+      <w:lvlText w:val="o"/>
+      <w:lvlJc w:val="left"/>
+      <w:pPr>
+        <w:ind w:left="6840" w:hanging="360"/>
+      </w:pPr>
+      <w:rPr>
+        <w:rFonts w:ascii="Courier New" w:hAnsi="Courier New" w:cs="Courier New" w:hint="default"/>
+      </w:rPr>
+    </w:lvl>
+    <w:lvl w:ilvl="8" w:tplc="04090005" w:tentative="1">
+      <w:start w:val="1"/>
+      <w:numFmt w:val="bullet"/>
+      <w:lvlText w:val=""/>
+      <w:lvlJc w:val="left"/>
+      <w:pPr>
+        <w:ind w:left="7560" w:hanging="360"/>
+      </w:pPr>
+      <w:rPr>
+        <w:rFonts w:ascii="Wingdings" w:hAnsi="Wingdings" w:hint="default"/>
+      </w:rPr>
+    </w:lvl>
+  </w:abstractNum>
+  <w:abstractNum w:abstractNumId="8" w15:restartNumberingAfterBreak="0">
     <w:nsid w:val="28E64B03"/>
     <w:multiLevelType w:val="multilevel"/>
     <w:tmpl w:val="0F54583A"/>
@@ -5960,7 +7664,7 @@
       </w:rPr>
     </w:lvl>
   </w:abstractNum>
-  <w:abstractNum w:abstractNumId="6" w15:restartNumberingAfterBreak="0">
+  <w:abstractNum w:abstractNumId="9" w15:restartNumberingAfterBreak="0">
     <w:nsid w:val="33D82415"/>
     <w:multiLevelType w:val="multilevel"/>
     <w:tmpl w:val="EBBC23D8"/>
@@ -6073,7 +7777,7 @@
       </w:pPr>
     </w:lvl>
   </w:abstractNum>
-  <w:abstractNum w:abstractNumId="7" w15:restartNumberingAfterBreak="0">
+  <w:abstractNum w:abstractNumId="10" w15:restartNumberingAfterBreak="0">
     <w:nsid w:val="397164EB"/>
     <w:multiLevelType w:val="multilevel"/>
     <w:tmpl w:val="BDB2F272"/>
@@ -6222,7 +7926,7 @@
       </w:rPr>
     </w:lvl>
   </w:abstractNum>
-  <w:abstractNum w:abstractNumId="8" w15:restartNumberingAfterBreak="0">
+  <w:abstractNum w:abstractNumId="11" w15:restartNumberingAfterBreak="0">
     <w:nsid w:val="3D2B5109"/>
     <w:multiLevelType w:val="hybridMultilevel"/>
     <w:tmpl w:val="494C6266"/>
@@ -6335,7 +8039,120 @@
       </w:rPr>
     </w:lvl>
   </w:abstractNum>
-  <w:abstractNum w:abstractNumId="9" w15:restartNumberingAfterBreak="0">
+  <w:abstractNum w:abstractNumId="12" w15:restartNumberingAfterBreak="0">
+    <w:nsid w:val="52512879"/>
+    <w:multiLevelType w:val="hybridMultilevel"/>
+    <w:tmpl w:val="D68C3320"/>
+    <w:lvl w:ilvl="0" w:tplc="04090001">
+      <w:start w:val="1"/>
+      <w:numFmt w:val="bullet"/>
+      <w:lvlText w:val=""/>
+      <w:lvlJc w:val="left"/>
+      <w:pPr>
+        <w:ind w:left="720" w:hanging="360"/>
+      </w:pPr>
+      <w:rPr>
+        <w:rFonts w:ascii="Symbol" w:hAnsi="Symbol" w:hint="default"/>
+      </w:rPr>
+    </w:lvl>
+    <w:lvl w:ilvl="1" w:tplc="04090003" w:tentative="1">
+      <w:start w:val="1"/>
+      <w:numFmt w:val="bullet"/>
+      <w:lvlText w:val="o"/>
+      <w:lvlJc w:val="left"/>
+      <w:pPr>
+        <w:ind w:left="1440" w:hanging="360"/>
+      </w:pPr>
+      <w:rPr>
+        <w:rFonts w:ascii="Courier New" w:hAnsi="Courier New" w:cs="Courier New" w:hint="default"/>
+      </w:rPr>
+    </w:lvl>
+    <w:lvl w:ilvl="2" w:tplc="04090005" w:tentative="1">
+      <w:start w:val="1"/>
+      <w:numFmt w:val="bullet"/>
+      <w:lvlText w:val=""/>
+      <w:lvlJc w:val="left"/>
+      <w:pPr>
+        <w:ind w:left="2160" w:hanging="360"/>
+      </w:pPr>
+      <w:rPr>
+        <w:rFonts w:ascii="Wingdings" w:hAnsi="Wingdings" w:hint="default"/>
+      </w:rPr>
+    </w:lvl>
+    <w:lvl w:ilvl="3" w:tplc="04090001" w:tentative="1">
+      <w:start w:val="1"/>
+      <w:numFmt w:val="bullet"/>
+      <w:lvlText w:val=""/>
+      <w:lvlJc w:val="left"/>
+      <w:pPr>
+        <w:ind w:left="2880" w:hanging="360"/>
+      </w:pPr>
+      <w:rPr>
+        <w:rFonts w:ascii="Symbol" w:hAnsi="Symbol" w:hint="default"/>
+      </w:rPr>
+    </w:lvl>
+    <w:lvl w:ilvl="4" w:tplc="04090003" w:tentative="1">
+      <w:start w:val="1"/>
+      <w:numFmt w:val="bullet"/>
+      <w:lvlText w:val="o"/>
+      <w:lvlJc w:val="left"/>
+      <w:pPr>
+        <w:ind w:left="3600" w:hanging="360"/>
+      </w:pPr>
+      <w:rPr>
+        <w:rFonts w:ascii="Courier New" w:hAnsi="Courier New" w:cs="Courier New" w:hint="default"/>
+      </w:rPr>
+    </w:lvl>
+    <w:lvl w:ilvl="5" w:tplc="04090005" w:tentative="1">
+      <w:start w:val="1"/>
+      <w:numFmt w:val="bullet"/>
+      <w:lvlText w:val=""/>
+      <w:lvlJc w:val="left"/>
+      <w:pPr>
+        <w:ind w:left="4320" w:hanging="360"/>
+      </w:pPr>
+      <w:rPr>
+        <w:rFonts w:ascii="Wingdings" w:hAnsi="Wingdings" w:hint="default"/>
+      </w:rPr>
+    </w:lvl>
+    <w:lvl w:ilvl="6" w:tplc="04090001" w:tentative="1">
+      <w:start w:val="1"/>
+      <w:numFmt w:val="bullet"/>
+      <w:lvlText w:val=""/>
+      <w:lvlJc w:val="left"/>
+      <w:pPr>
+        <w:ind w:left="5040" w:hanging="360"/>
+      </w:pPr>
+      <w:rPr>
+        <w:rFonts w:ascii="Symbol" w:hAnsi="Symbol" w:hint="default"/>
+      </w:rPr>
+    </w:lvl>
+    <w:lvl w:ilvl="7" w:tplc="04090003" w:tentative="1">
+      <w:start w:val="1"/>
+      <w:numFmt w:val="bullet"/>
+      <w:lvlText w:val="o"/>
+      <w:lvlJc w:val="left"/>
+      <w:pPr>
+        <w:ind w:left="5760" w:hanging="360"/>
+      </w:pPr>
+      <w:rPr>
+        <w:rFonts w:ascii="Courier New" w:hAnsi="Courier New" w:cs="Courier New" w:hint="default"/>
+      </w:rPr>
+    </w:lvl>
+    <w:lvl w:ilvl="8" w:tplc="04090005" w:tentative="1">
+      <w:start w:val="1"/>
+      <w:numFmt w:val="bullet"/>
+      <w:lvlText w:val=""/>
+      <w:lvlJc w:val="left"/>
+      <w:pPr>
+        <w:ind w:left="6480" w:hanging="360"/>
+      </w:pPr>
+      <w:rPr>
+        <w:rFonts w:ascii="Wingdings" w:hAnsi="Wingdings" w:hint="default"/>
+      </w:rPr>
+    </w:lvl>
+  </w:abstractNum>
+  <w:abstractNum w:abstractNumId="13" w15:restartNumberingAfterBreak="0">
     <w:nsid w:val="55B11FA5"/>
     <w:multiLevelType w:val="hybridMultilevel"/>
     <w:tmpl w:val="5226FD1C"/>
@@ -6448,7 +8265,7 @@
       </w:rPr>
     </w:lvl>
   </w:abstractNum>
-  <w:abstractNum w:abstractNumId="10" w15:restartNumberingAfterBreak="0">
+  <w:abstractNum w:abstractNumId="14" w15:restartNumberingAfterBreak="0">
     <w:nsid w:val="58CF5717"/>
     <w:multiLevelType w:val="multilevel"/>
     <w:tmpl w:val="C4186726"/>
@@ -6561,7 +8378,7 @@
       </w:pPr>
     </w:lvl>
   </w:abstractNum>
-  <w:abstractNum w:abstractNumId="11" w15:restartNumberingAfterBreak="0">
+  <w:abstractNum w:abstractNumId="15" w15:restartNumberingAfterBreak="0">
     <w:nsid w:val="60AD130E"/>
     <w:multiLevelType w:val="hybridMultilevel"/>
     <w:tmpl w:val="6F603190"/>
@@ -6674,7 +8491,124 @@
       </w:rPr>
     </w:lvl>
   </w:abstractNum>
-  <w:abstractNum w:abstractNumId="12" w15:restartNumberingAfterBreak="0">
+  <w:abstractNum w:abstractNumId="16" w15:restartNumberingAfterBreak="0">
+    <w:nsid w:val="65A12C28"/>
+    <w:multiLevelType w:val="multilevel"/>
+    <w:tmpl w:val="66D68C5E"/>
+    <w:lvl w:ilvl="0">
+      <w:start w:val="1"/>
+      <w:numFmt w:val="decimal"/>
+      <w:lvlText w:val="%1."/>
+      <w:lvlJc w:val="left"/>
+      <w:pPr>
+        <w:tabs>
+          <w:tab w:val="num" w:pos="720"/>
+        </w:tabs>
+        <w:ind w:left="720" w:hanging="360"/>
+      </w:pPr>
+    </w:lvl>
+    <w:lvl w:ilvl="1">
+      <w:start w:val="1"/>
+      <w:numFmt w:val="bullet"/>
+      <w:lvlText w:val="o"/>
+      <w:lvlJc w:val="left"/>
+      <w:pPr>
+        <w:tabs>
+          <w:tab w:val="num" w:pos="1440"/>
+        </w:tabs>
+        <w:ind w:left="1440" w:hanging="360"/>
+      </w:pPr>
+      <w:rPr>
+        <w:rFonts w:ascii="Courier New" w:hAnsi="Courier New" w:hint="default"/>
+        <w:sz w:val="20"/>
+      </w:rPr>
+    </w:lvl>
+    <w:lvl w:ilvl="2" w:tentative="1">
+      <w:start w:val="1"/>
+      <w:numFmt w:val="decimal"/>
+      <w:lvlText w:val="%3."/>
+      <w:lvlJc w:val="left"/>
+      <w:pPr>
+        <w:tabs>
+          <w:tab w:val="num" w:pos="2160"/>
+        </w:tabs>
+        <w:ind w:left="2160" w:hanging="360"/>
+      </w:pPr>
+    </w:lvl>
+    <w:lvl w:ilvl="3" w:tentative="1">
+      <w:start w:val="1"/>
+      <w:numFmt w:val="decimal"/>
+      <w:lvlText w:val="%4."/>
+      <w:lvlJc w:val="left"/>
+      <w:pPr>
+        <w:tabs>
+          <w:tab w:val="num" w:pos="2880"/>
+        </w:tabs>
+        <w:ind w:left="2880" w:hanging="360"/>
+      </w:pPr>
+    </w:lvl>
+    <w:lvl w:ilvl="4" w:tentative="1">
+      <w:start w:val="1"/>
+      <w:numFmt w:val="decimal"/>
+      <w:lvlText w:val="%5."/>
+      <w:lvlJc w:val="left"/>
+      <w:pPr>
+        <w:tabs>
+          <w:tab w:val="num" w:pos="3600"/>
+        </w:tabs>
+        <w:ind w:left="3600" w:hanging="360"/>
+      </w:pPr>
+    </w:lvl>
+    <w:lvl w:ilvl="5" w:tentative="1">
+      <w:start w:val="1"/>
+      <w:numFmt w:val="decimal"/>
+      <w:lvlText w:val="%6."/>
+      <w:lvlJc w:val="left"/>
+      <w:pPr>
+        <w:tabs>
+          <w:tab w:val="num" w:pos="4320"/>
+        </w:tabs>
+        <w:ind w:left="4320" w:hanging="360"/>
+      </w:pPr>
+    </w:lvl>
+    <w:lvl w:ilvl="6" w:tentative="1">
+      <w:start w:val="1"/>
+      <w:numFmt w:val="decimal"/>
+      <w:lvlText w:val="%7."/>
+      <w:lvlJc w:val="left"/>
+      <w:pPr>
+        <w:tabs>
+          <w:tab w:val="num" w:pos="5040"/>
+        </w:tabs>
+        <w:ind w:left="5040" w:hanging="360"/>
+      </w:pPr>
+    </w:lvl>
+    <w:lvl w:ilvl="7" w:tentative="1">
+      <w:start w:val="1"/>
+      <w:numFmt w:val="decimal"/>
+      <w:lvlText w:val="%8."/>
+      <w:lvlJc w:val="left"/>
+      <w:pPr>
+        <w:tabs>
+          <w:tab w:val="num" w:pos="5760"/>
+        </w:tabs>
+        <w:ind w:left="5760" w:hanging="360"/>
+      </w:pPr>
+    </w:lvl>
+    <w:lvl w:ilvl="8" w:tentative="1">
+      <w:start w:val="1"/>
+      <w:numFmt w:val="decimal"/>
+      <w:lvlText w:val="%9."/>
+      <w:lvlJc w:val="left"/>
+      <w:pPr>
+        <w:tabs>
+          <w:tab w:val="num" w:pos="6480"/>
+        </w:tabs>
+        <w:ind w:left="6480" w:hanging="360"/>
+      </w:pPr>
+    </w:lvl>
+  </w:abstractNum>
+  <w:abstractNum w:abstractNumId="17" w15:restartNumberingAfterBreak="0">
     <w:nsid w:val="68402BDE"/>
     <w:multiLevelType w:val="multilevel"/>
     <w:tmpl w:val="5C00E1C8"/>
@@ -6823,7 +8757,7 @@
       </w:rPr>
     </w:lvl>
   </w:abstractNum>
-  <w:abstractNum w:abstractNumId="13" w15:restartNumberingAfterBreak="0">
+  <w:abstractNum w:abstractNumId="18" w15:restartNumberingAfterBreak="0">
     <w:nsid w:val="69315CA7"/>
     <w:multiLevelType w:val="hybridMultilevel"/>
     <w:tmpl w:val="9056AE96"/>
@@ -6909,7 +8843,7 @@
       </w:pPr>
     </w:lvl>
   </w:abstractNum>
-  <w:abstractNum w:abstractNumId="14" w15:restartNumberingAfterBreak="0">
+  <w:abstractNum w:abstractNumId="19" w15:restartNumberingAfterBreak="0">
     <w:nsid w:val="702C132A"/>
     <w:multiLevelType w:val="hybridMultilevel"/>
     <w:tmpl w:val="CE366DB0"/>
@@ -6995,7 +8929,7 @@
       </w:pPr>
     </w:lvl>
   </w:abstractNum>
-  <w:abstractNum w:abstractNumId="15" w15:restartNumberingAfterBreak="0">
+  <w:abstractNum w:abstractNumId="20" w15:restartNumberingAfterBreak="0">
     <w:nsid w:val="70BD4F13"/>
     <w:multiLevelType w:val="multilevel"/>
     <w:tmpl w:val="9A4031E0"/>
@@ -7144,7 +9078,7 @@
       </w:rPr>
     </w:lvl>
   </w:abstractNum>
-  <w:abstractNum w:abstractNumId="16" w15:restartNumberingAfterBreak="0">
+  <w:abstractNum w:abstractNumId="21" w15:restartNumberingAfterBreak="0">
     <w:nsid w:val="70F00337"/>
     <w:multiLevelType w:val="multilevel"/>
     <w:tmpl w:val="22E64CF8"/>
@@ -7293,7 +9227,7 @@
       </w:rPr>
     </w:lvl>
   </w:abstractNum>
-  <w:abstractNum w:abstractNumId="17" w15:restartNumberingAfterBreak="0">
+  <w:abstractNum w:abstractNumId="22" w15:restartNumberingAfterBreak="0">
     <w:nsid w:val="7C5C2A11"/>
     <w:multiLevelType w:val="multilevel"/>
     <w:tmpl w:val="17043D6A"/>
@@ -7443,68 +9377,75 @@
     </w:lvl>
   </w:abstractNum>
   <w:num w:numId="1" w16cid:durableId="647512073">
-    <w:abstractNumId w:val="11"/>
+    <w:abstractNumId w:val="15"/>
   </w:num>
   <w:num w:numId="2" w16cid:durableId="1107196031">
-    <w:abstractNumId w:val="14"/>
+    <w:abstractNumId w:val="19"/>
   </w:num>
   <w:num w:numId="3" w16cid:durableId="1280798664">
     <w:abstractNumId w:val="1"/>
   </w:num>
   <w:num w:numId="4" w16cid:durableId="381101270">
-    <w:abstractNumId w:val="13"/>
+    <w:abstractNumId w:val="18"/>
   </w:num>
   <w:num w:numId="5" w16cid:durableId="1383401194">
-    <w:abstractNumId w:val="10"/>
+    <w:abstractNumId w:val="14"/>
   </w:num>
   <w:num w:numId="6" w16cid:durableId="1336685725">
-    <w:abstractNumId w:val="6"/>
+    <w:abstractNumId w:val="9"/>
   </w:num>
   <w:num w:numId="7" w16cid:durableId="840586189">
     <w:abstractNumId w:val="0"/>
   </w:num>
   <w:num w:numId="8" w16cid:durableId="632292796">
+    <w:abstractNumId w:val="4"/>
+  </w:num>
+  <w:num w:numId="9" w16cid:durableId="1278760053">
     <w:abstractNumId w:val="3"/>
   </w:num>
-  <w:num w:numId="9" w16cid:durableId="1278760053">
+  <w:num w:numId="10" w16cid:durableId="395204260">
+    <w:abstractNumId w:val="21"/>
+  </w:num>
+  <w:num w:numId="11" w16cid:durableId="1125007754">
+    <w:abstractNumId w:val="10"/>
+  </w:num>
+  <w:num w:numId="12" w16cid:durableId="1959990674">
+    <w:abstractNumId w:val="20"/>
+  </w:num>
+  <w:num w:numId="13" w16cid:durableId="938803841">
+    <w:abstractNumId w:val="22"/>
+  </w:num>
+  <w:num w:numId="14" w16cid:durableId="631987323">
+    <w:abstractNumId w:val="6"/>
+  </w:num>
+  <w:num w:numId="15" w16cid:durableId="252786406">
+    <w:abstractNumId w:val="13"/>
+  </w:num>
+  <w:num w:numId="16" w16cid:durableId="1661960188">
+    <w:abstractNumId w:val="11"/>
+  </w:num>
+  <w:num w:numId="17" w16cid:durableId="620460177">
+    <w:abstractNumId w:val="17"/>
+  </w:num>
+  <w:num w:numId="18" w16cid:durableId="495220474">
+    <w:abstractNumId w:val="8"/>
+  </w:num>
+  <w:num w:numId="19" w16cid:durableId="890462569">
+    <w:abstractNumId w:val="16"/>
+  </w:num>
+  <w:num w:numId="20" w16cid:durableId="1484085064">
+    <w:abstractNumId w:val="7"/>
+  </w:num>
+  <w:num w:numId="21" w16cid:durableId="33239150">
+    <w:abstractNumId w:val="5"/>
+  </w:num>
+  <w:num w:numId="22" w16cid:durableId="1587689365">
     <w:abstractNumId w:val="2"/>
   </w:num>
-  <w:num w:numId="10" w16cid:durableId="395204260">
-    <w:abstractNumId w:val="16"/>
-  </w:num>
-  <w:num w:numId="11" w16cid:durableId="1125007754">
-    <w:abstractNumId w:val="7"/>
-  </w:num>
-  <w:num w:numId="12" w16cid:durableId="1959990674">
-    <w:abstractNumId w:val="15"/>
-  </w:num>
-  <w:num w:numId="13" w16cid:durableId="938803841">
-    <w:abstractNumId w:val="17"/>
-  </w:num>
-  <w:num w:numId="14" w16cid:durableId="631987323">
-    <w:abstractNumId w:val="4"/>
-  </w:num>
-  <w:num w:numId="15" w16cid:durableId="252786406">
-    <w:abstractNumId w:val="9"/>
-  </w:num>
-  <w:num w:numId="16" w16cid:durableId="1661960188">
-    <w:abstractNumId w:val="8"/>
-  </w:num>
-  <w:num w:numId="17" w16cid:durableId="620460177">
+  <w:num w:numId="23" w16cid:durableId="2061123192">
     <w:abstractNumId w:val="12"/>
   </w:num>
-  <w:num w:numId="18" w16cid:durableId="495220474">
-    <w:abstractNumId w:val="5"/>
-  </w:num>
 </w:numbering>
-</file>
-
-<file path=word/people.xml><?xml version="1.0" encoding="utf-8"?>
-<w15:people xmlns:wpc="http://schemas.microsoft.com/office/word/2010/wordprocessingCanvas" xmlns:cx="http://schemas.microsoft.com/office/drawing/2014/chartex" xmlns:cx1="http://schemas.microsoft.com/office/drawing/2015/9/8/chartex" xmlns:cx2="http://schemas.microsoft.com/office/drawing/2015/10/21/chartex" xmlns:cx3="http://schemas.microsoft.com/office/drawing/2016/5/9/chartex" xmlns:cx4="http://schemas.microsoft.com/office/drawing/2016/5/10/chartex" xmlns:cx5="http://schemas.microsoft.com/office/drawing/2016/5/11/chartex" xmlns:cx6="http://schemas.microsoft.com/office/drawing/2016/5/12/chartex" xmlns:cx7="http://schemas.microsoft.com/office/drawing/2016/5/13/chartex" xmlns:cx8="http://schemas.microsoft.com/office/drawing/2016/5/14/chartex" xmlns:mc="http://schemas.openxmlformats.org/markup-compatibility/2006" xmlns:aink="http://schemas.microsoft.com/office/drawing/2016/ink" xmlns:am3d="http://schemas.microsoft.com/office/drawing/2017/model3d" xmlns:o="urn:schemas-microsoft-com:office:office" xmlns:oel="http://schemas.microsoft.com/office/2019/extlst" xmlns:r="http://schemas.openxmlformats.org/officeDocument/2006/relationships" xmlns:m="http://schemas.openxmlformats.org/officeDocument/2006/math" xmlns:v="urn:schemas-microsoft-com:vml" xmlns:wp14="http://schemas.microsoft.com/office/word/2010/wordprocessingDrawing" xmlns:wp="http://schemas.openxmlformats.org/drawingml/2006/wordprocessingDrawing" xmlns:w10="urn:schemas-microsoft-com:office:word" xmlns:w="http://schemas.openxmlformats.org/wordprocessingml/2006/main" xmlns:w14="http://schemas.microsoft.com/office/word/2010/wordml" xmlns:w15="http://schemas.microsoft.com/office/word/2012/wordml" xmlns:w16cex="http://schemas.microsoft.com/office/word/2018/wordml/cex" xmlns:w16cid="http://schemas.microsoft.com/office/word/2016/wordml/cid" xmlns:w16="http://schemas.microsoft.com/office/word/2018/wordml" xmlns:w16du="http://schemas.microsoft.com/office/word/2023/wordml/word16du" xmlns:w16sdtdh="http://schemas.microsoft.com/office/word/2020/wordml/sdtdatahash" xmlns:w16sdtfl="http://schemas.microsoft.com/office/word/2024/wordml/sdtformatlock" xmlns:w16se="http://schemas.microsoft.com/office/word/2015/wordml/symex" xmlns:wpg="http://schemas.microsoft.com/office/word/2010/wordprocessingGroup" xmlns:wpi="http://schemas.microsoft.com/office/word/2010/wordprocessingInk" xmlns:wne="http://schemas.microsoft.com/office/word/2006/wordml" xmlns:wps="http://schemas.microsoft.com/office/word/2010/wordprocessingShape" mc:Ignorable="w14 w15 w16se w16cid w16 w16cex w16sdtdh w16sdtfl w16du wp14">
-  <w15:person w15:author="Cesar Eduardo Inda Ceniceros">
-    <w15:presenceInfo w15:providerId="AD" w15:userId="S::usuario_cocyten_31_x@cinvestav.mx::bff949cc-4172-45b4-a3f9-2a5590c8c397"/>
-  </w15:person>
-</w15:people>
 </file>
 
 <file path=word/styles.xml><?xml version="1.0" encoding="utf-8"?>
@@ -8112,7 +10053,6 @@
   <w:style w:type="character" w:default="1" w:styleId="Fuentedeprrafopredeter">
     <w:name w:val="Default Paragraph Font"/>
     <w:uiPriority w:val="1"/>
-    <w:semiHidden/>
     <w:unhideWhenUsed/>
   </w:style>
   <w:style w:type="table" w:default="1" w:styleId="Tablanormal">
@@ -8682,6 +10622,18 @@
       <w:lang w:val="en-US"/>
     </w:rPr>
   </w:style>
+  <w:style w:type="character" w:styleId="Mencinsinresolver">
+    <w:name w:val="Unresolved Mention"/>
+    <w:basedOn w:val="Fuentedeprrafopredeter"/>
+    <w:uiPriority w:val="99"/>
+    <w:semiHidden/>
+    <w:unhideWhenUsed/>
+    <w:rsid w:val="00891A5F"/>
+    <w:rPr>
+      <w:color w:val="605E5C"/>
+      <w:shd w:val="clear" w:color="auto" w:fill="E1DFDD"/>
+    </w:rPr>
+  </w:style>
 </w:styles>
 </file>
 
@@ -8981,15 +10933,21 @@
 </file>
 
 <file path=customXml/item1.xml><?xml version="1.0" encoding="utf-8"?>
-<?mso-contentType ?>
-<FormTemplates xmlns="http://schemas.microsoft.com/sharepoint/v3/contenttype/forms">
-  <Display>DocumentLibraryForm</Display>
-  <Edit>DocumentLibraryForm</Edit>
-  <New>DocumentLibraryForm</New>
-</FormTemplates>
+<b:Sources xmlns:b="http://schemas.openxmlformats.org/officeDocument/2006/bibliography" xmlns="http://schemas.openxmlformats.org/officeDocument/2006/bibliography" SelectedStyle="\APASixthEditionOfficeOnline.xsl" StyleName="APA" Version="6"/>
 </file>
 
 <file path=customXml/item2.xml><?xml version="1.0" encoding="utf-8"?>
+<p:properties xmlns:p="http://schemas.microsoft.com/office/2006/metadata/properties" xmlns:xsi="http://www.w3.org/2001/XMLSchema-instance" xmlns:pc="http://schemas.microsoft.com/office/infopath/2007/PartnerControls">
+  <documentManagement>
+    <lcf76f155ced4ddcb4097134ff3c332f xmlns="7573ad77-4f67-4c5a-b216-eca64b62a256">
+      <Terms xmlns="http://schemas.microsoft.com/office/infopath/2007/PartnerControls"/>
+    </lcf76f155ced4ddcb4097134ff3c332f>
+    <TaxCatchAll xmlns="c8f38ea3-53ef-4274-bdc9-48729cb00c23" xsi:nil="true"/>
+  </documentManagement>
+</p:properties>
+</file>
+
+<file path=customXml/item3.xml><?xml version="1.0" encoding="utf-8"?>
 <ct:contentTypeSchema xmlns:ct="http://schemas.microsoft.com/office/2006/metadata/contentType" xmlns:ma="http://schemas.microsoft.com/office/2006/metadata/properties/metaAttributes" ct:_="" ma:_="" ma:contentTypeName="Documento" ma:contentTypeID="0x010100D4E028BA32A04546B82B0EECDBEA9BAD" ma:contentTypeVersion="12" ma:contentTypeDescription="Crear nuevo documento." ma:contentTypeScope="" ma:versionID="7c15f775a92c32cd8b48a48af3a14593">
   <xsd:schema xmlns:xsd="http://www.w3.org/2001/XMLSchema" xmlns:xs="http://www.w3.org/2001/XMLSchema" xmlns:p="http://schemas.microsoft.com/office/2006/metadata/properties" xmlns:ns2="7573ad77-4f67-4c5a-b216-eca64b62a256" xmlns:ns3="c8f38ea3-53ef-4274-bdc9-48729cb00c23" targetNamespace="http://schemas.microsoft.com/office/2006/metadata/properties" ma:root="true" ma:fieldsID="50ac1af4cd03ac7c6e9305773e4fe22a" ns2:_="" ns3:_="">
     <xsd:import namespace="7573ad77-4f67-4c5a-b216-eca64b62a256"/>
@@ -9190,30 +11148,35 @@
 </ct:contentTypeSchema>
 </file>
 
-<file path=customXml/item3.xml><?xml version="1.0" encoding="utf-8"?>
-<p:properties xmlns:p="http://schemas.microsoft.com/office/2006/metadata/properties" xmlns:xsi="http://www.w3.org/2001/XMLSchema-instance" xmlns:pc="http://schemas.microsoft.com/office/infopath/2007/PartnerControls">
-  <documentManagement>
-    <lcf76f155ced4ddcb4097134ff3c332f xmlns="7573ad77-4f67-4c5a-b216-eca64b62a256">
-      <Terms xmlns="http://schemas.microsoft.com/office/infopath/2007/PartnerControls"/>
-    </lcf76f155ced4ddcb4097134ff3c332f>
-    <TaxCatchAll xmlns="c8f38ea3-53ef-4274-bdc9-48729cb00c23" xsi:nil="true"/>
-  </documentManagement>
-</p:properties>
-</file>
-
 <file path=customXml/item4.xml><?xml version="1.0" encoding="utf-8"?>
-<b:Sources xmlns:b="http://schemas.openxmlformats.org/officeDocument/2006/bibliography" xmlns="http://schemas.openxmlformats.org/officeDocument/2006/bibliography" SelectedStyle="\APASixthEditionOfficeOnline.xsl" StyleName="APA" Version="6"/>
+<?mso-contentType ?>
+<FormTemplates xmlns="http://schemas.microsoft.com/sharepoint/v3/contenttype/forms">
+  <Display>DocumentLibraryForm</Display>
+  <Edit>DocumentLibraryForm</Edit>
+  <New>DocumentLibraryForm</New>
+</FormTemplates>
 </file>
 
 <file path=customXml/itemProps1.xml><?xml version="1.0" encoding="utf-8"?>
-<ds:datastoreItem xmlns:ds="http://schemas.openxmlformats.org/officeDocument/2006/customXml" ds:itemID="{68FE0CE6-74F3-4210-9B6B-3A98101DD537}">
+<ds:datastoreItem xmlns:ds="http://schemas.openxmlformats.org/officeDocument/2006/customXml" ds:itemID="{B47AFC8C-50B1-48D9-94F7-4FBF3DD8A80C}">
   <ds:schemaRefs>
-    <ds:schemaRef ds:uri="http://schemas.microsoft.com/sharepoint/v3/contenttype/forms"/>
+    <ds:schemaRef ds:uri="http://schemas.openxmlformats.org/officeDocument/2006/bibliography"/>
   </ds:schemaRefs>
 </ds:datastoreItem>
 </file>
 
 <file path=customXml/itemProps2.xml><?xml version="1.0" encoding="utf-8"?>
+<ds:datastoreItem xmlns:ds="http://schemas.openxmlformats.org/officeDocument/2006/customXml" ds:itemID="{B5A557AC-E877-4326-ABC8-A22B76820975}">
+  <ds:schemaRefs>
+    <ds:schemaRef ds:uri="http://schemas.microsoft.com/office/2006/metadata/properties"/>
+    <ds:schemaRef ds:uri="http://schemas.microsoft.com/office/infopath/2007/PartnerControls"/>
+    <ds:schemaRef ds:uri="7573ad77-4f67-4c5a-b216-eca64b62a256"/>
+    <ds:schemaRef ds:uri="c8f38ea3-53ef-4274-bdc9-48729cb00c23"/>
+  </ds:schemaRefs>
+</ds:datastoreItem>
+</file>
+
+<file path=customXml/itemProps3.xml><?xml version="1.0" encoding="utf-8"?>
 <ds:datastoreItem xmlns:ds="http://schemas.openxmlformats.org/officeDocument/2006/customXml" ds:itemID="{7A3F6424-920D-4ABC-BF70-EAE143A30824}">
   <ds:schemaRefs>
     <ds:schemaRef ds:uri="http://schemas.microsoft.com/office/2006/metadata/contentType"/>
@@ -9232,21 +11195,10 @@
 </ds:datastoreItem>
 </file>
 
-<file path=customXml/itemProps3.xml><?xml version="1.0" encoding="utf-8"?>
-<ds:datastoreItem xmlns:ds="http://schemas.openxmlformats.org/officeDocument/2006/customXml" ds:itemID="{B5A557AC-E877-4326-ABC8-A22B76820975}">
+<file path=customXml/itemProps4.xml><?xml version="1.0" encoding="utf-8"?>
+<ds:datastoreItem xmlns:ds="http://schemas.openxmlformats.org/officeDocument/2006/customXml" ds:itemID="{68FE0CE6-74F3-4210-9B6B-3A98101DD537}">
   <ds:schemaRefs>
-    <ds:schemaRef ds:uri="http://schemas.microsoft.com/office/2006/metadata/properties"/>
-    <ds:schemaRef ds:uri="http://schemas.microsoft.com/office/infopath/2007/PartnerControls"/>
-    <ds:schemaRef ds:uri="7573ad77-4f67-4c5a-b216-eca64b62a256"/>
-    <ds:schemaRef ds:uri="c8f38ea3-53ef-4274-bdc9-48729cb00c23"/>
-  </ds:schemaRefs>
-</ds:datastoreItem>
-</file>
-
-<file path=customXml/itemProps4.xml><?xml version="1.0" encoding="utf-8"?>
-<ds:datastoreItem xmlns:ds="http://schemas.openxmlformats.org/officeDocument/2006/customXml" ds:itemID="{B47AFC8C-50B1-48D9-94F7-4FBF3DD8A80C}">
-  <ds:schemaRefs>
-    <ds:schemaRef ds:uri="http://schemas.openxmlformats.org/officeDocument/2006/bibliography"/>
+    <ds:schemaRef ds:uri="http://schemas.microsoft.com/sharepoint/v3/contenttype/forms"/>
   </ds:schemaRefs>
 </ds:datastoreItem>
 </file>
</xml_diff>